<commit_message>
Allinea smf80dmp.mk a get_CDT, corregge extract_data e getExt
- smf80dmp.mk riscritto sul modello di smf80ext.mk: oggetti linkati
  direttamente (niente piu' myext.a), get_CDT/irrcdt al posto di getCls,
  routine METAL racfree/racstat, dipendenze -qmakedep, DBG/AGGR, listing
  in ./lst e messaggi del binder in smf80dmp.lnk.
- get_CDT.c extract_data(): c_desc portato a 81 byte (la descrizione
  completa superava i 51 e sforava sullo stack); cls_RC riceve il DEFRC
  e non piu' la lunghezza massima; DEFRC e XREF copiati con il nuovo
  copy_field_text(), senza memory leak ne' abend se il campo e' vuoto;
  c_mem[0] azzerato correttamente; rimosse variabili inutilizzate.
- getExt.c: basename() lavora su una copia di path_name (evita il
  CCN3280 su const char* e la modifica della stringa del chiamante);
  nome terminato da NUL e nessun leak nei casi di errore.
- Documentazione aggiornata di conseguenza.

Co-Authored-By: Claude Opus 5.5 <noreply@anthropic.com>
</commit_message>
<xml_diff>
--- a/smf80_documentazione_tecnica.docx
+++ b/smf80_documentazione_tecnica.docx
@@ -232,7 +232,7 @@
     <w:p/>
     <w:p>
       <w:r>
-        <w:t>Entrambi i programmi filtro condividono la stessa logica di parsing dei criteri e si appoggiano a un insieme di funzioni di supporto: smf80dmp le usa tramite la libreria statica myext.a (makefile smf80dmp.mk), mentre smf80ext linka direttamente i singoli oggetti insieme alle routine Metal C per l'accesso a RACF (makefile smf80ext.mk, vedi 4.1). L'elenco delle classi RACF non viene più letto da un membro del PDS di controllo (getCls.c, membro SM80CLS prodotto da REXX): è ricavato in diretta dalla Class Descriptor Table, statica e dinamica, tramite RACROUTE REQUEST=STAT (get_CDT.c). Le schede del capitolo 3 seguono l'ordine di compilazione; quelle delle nuove funzioni RACF (get_CDT.c, irrcdt.c, irrauth.c e routine Metal C) sono inserite al posto di getCls.c, con in coda i file non referenziati dai makefile.</w:t>
+        <w:t>Entrambi i programmi filtro condividono la stessa logica di parsing dei criteri e si appoggiano a un insieme di funzioni di supporto: entrambi i makefile (smf80dmp.mk e smf80ext.mk) linkano direttamente i singoli oggetti insieme alle routine Metal C per l'accesso a RACF (vedi 4.1). L'elenco delle classi RACF non viene più letto da un membro del PDS di controllo (getCls.c, membro SM80CLS prodotto da REXX): è ricavato in diretta dalla Class Descriptor Table, statica e dinamica, tramite RACROUTE REQUEST=STAT (get_CDT.c). Le schede del capitolo 3 seguono l'ordine di compilazione; quelle delle nuove funzioni RACF (get_CDT.c, irrcdt.c, irrauth.c e routine Metal C) sono inserite al posto di getCls.c, con in coda i file non referenziati dai makefile.</w:t>
       </w:r>
     </w:p>
     <w:p>
@@ -591,7 +591,7 @@
     </w:p>
     <w:p>
       <w:r>
-        <w:t>Le funzioni sono compilate individualmente. smf80dmp.mk le archivia nella libreria statica myext.a; smf80ext.mk linka direttamente gli oggetti (.o) insieme a quelli delle routine Metal C descritte in 2.3.</w:t>
+        <w:t>Le funzioni sono compilate individualmente in oggetti (.o), condivisi tra smf80dmp.mk e smf80ext.mk, e linkate direttamente con il programma principale e con le routine Metal C descritte in 2.3. La libreria statica myext.a non è più utilizzata.</w:t>
       </w:r>
     </w:p>
     <w:tbl>
@@ -1412,7 +1412,7 @@
           </w:tcPr>
           <w:p>
             <w:r>
-              <w:t>Versione precedente della lettura delle classi RACF dal membro SM80CLS del PDS di controllo (prodotto dal REXX XCDTPROF). Sostituita da get_CDT.c; è ancora nell'elenco MYMEMB di smf80dmp.mk (vedi 4.1).</w:t>
+              <w:t>Versione precedente della lettura delle classi RACF dal membro SM80CLS del PDS di controllo (prodotto dal REXX XCDTPROF). Sostituita da get_CDT.c in entrambi i makefile.</w:t>
             </w:r>
           </w:p>
         </w:tc>
@@ -9018,7 +9018,7 @@
         <w:pStyle w:val="Heading3"/>
       </w:pPr>
       <w:r>
-        <w:t>racseq_free_profile()</w:t>
+        <w:t>copy_field_text()</w:t>
       </w:r>
     </w:p>
     <w:p>
@@ -9028,7 +9028,7 @@
           <w:i/>
           <w:sz w:val="19"/>
         </w:rPr>
-        <w:t>void racseq_free_profile(RacseqProfile *p)</w:t>
+        <w:t>static void copy_field_text(const RacseqField *f, char *buf, size_t size)</w:t>
       </w:r>
     </w:p>
     <w:p>
@@ -9050,7 +9050,7 @@
         <w:t xml:space="preserve">Scopo: </w:t>
       </w:r>
       <w:r>
-        <w:t>Libera un profilo: prima le strutture analizzate (segmenti, campi, occorrenze, con free_profile_parsed), poi il buffer grezzo con free_raw_buffer, che usa free() per i buffer della pseudo-classe _CDT e r_admin_freemain per lo storage restituito da R_admin.</w:t>
+        <w:t>Copia un campo testuale nel buffer del chiamante, troncandolo a size-1 caratteri e terminandolo sempre con NUL; se il campo non esiste o è vuoto lascia il buffer vuoto. Non lascia memoria da liberare.</w:t>
       </w:r>
     </w:p>
     <w:p>
@@ -9111,7 +9111,7 @@
           </w:tcPr>
           <w:p>
             <w:r>
-              <w:t>p</w:t>
+              <w:t>f</w:t>
             </w:r>
           </w:p>
         </w:tc>
@@ -9121,7 +9121,51 @@
           </w:tcPr>
           <w:p>
             <w:r>
-              <w:t>profilo da liberare; azzerato al termine</w:t>
+              <w:t>campo testuale da copiare</w:t>
+            </w:r>
+          </w:p>
+        </w:tc>
+      </w:tr>
+      <w:tr>
+        <w:tc>
+          <w:tcPr>
+            <w:tcW w:type="dxa" w:w="1984"/>
+          </w:tcPr>
+          <w:p>
+            <w:r>
+              <w:t>buf</w:t>
+            </w:r>
+          </w:p>
+        </w:tc>
+        <w:tc>
+          <w:tcPr>
+            <w:tcW w:type="dxa" w:w="7087"/>
+          </w:tcPr>
+          <w:p>
+            <w:r>
+              <w:t>buffer di destinazione</w:t>
+            </w:r>
+          </w:p>
+        </w:tc>
+      </w:tr>
+      <w:tr>
+        <w:tc>
+          <w:tcPr>
+            <w:tcW w:type="dxa" w:w="1984"/>
+          </w:tcPr>
+          <w:p>
+            <w:r>
+              <w:t>size</w:t>
+            </w:r>
+          </w:p>
+        </w:tc>
+        <w:tc>
+          <w:tcPr>
+            <w:tcW w:type="dxa" w:w="7087"/>
+          </w:tcPr>
+          <w:p>
+            <w:r>
+              <w:t>dimensione del buffer in byte</w:t>
             </w:r>
           </w:p>
         </w:tc>
@@ -9146,32 +9190,16 @@
         <w:t xml:space="preserve">Note: </w:t>
       </w:r>
       <w:r>
-        <w:t>Richiamata da irrcdt_extract_next per liberare il profilo precedente.</w:t>
+        <w:t>Funzione locale a get_CDT.c; usata da extract_data per DEFRC e XREF.</w:t>
       </w:r>
     </w:p>
     <w:p/>
-    <w:p>
-      <w:pPr>
-        <w:pStyle w:val="Heading2"/>
-      </w:pPr>
-      <w:r>
-        <w:t>irrcdt.c</w:t>
-      </w:r>
-    </w:p>
-    <w:p>
-      <w:r>
-        <w:rPr>
-          <w:i/>
-        </w:rPr>
-        <w:t>Pseudo-classe "_CDT": voci della Class Descriptor Table presentate come RacseqProfile con un unico segmento "CDT".</w:t>
-      </w:r>
-    </w:p>
     <w:p>
       <w:pPr>
         <w:pStyle w:val="Heading3"/>
       </w:pPr>
       <w:r>
-        <w:t>irrcdt_is_pseudo_class()</w:t>
+        <w:t>racseq_free_profile()</w:t>
       </w:r>
     </w:p>
     <w:p>
@@ -9181,7 +9209,7 @@
           <w:i/>
           <w:sz w:val="19"/>
         </w:rPr>
-        <w:t>int irrcdt_is_pseudo_class(const char *class_name)</w:t>
+        <w:t>void racseq_free_profile(RacseqProfile *p)</w:t>
       </w:r>
     </w:p>
     <w:p>
@@ -9192,7 +9220,7 @@
         <w:t xml:space="preserve">File: </w:t>
       </w:r>
       <w:r>
-        <w:t>irrcdt.c</w:t>
+        <w:t>get_CDT.c</w:t>
       </w:r>
     </w:p>
     <w:p>
@@ -9203,7 +9231,7 @@
         <w:t xml:space="preserve">Scopo: </w:t>
       </w:r>
       <w:r>
-        <w:t>Indica se il nome classe richiesto corrisponde alla pseudo-classe "_CDT".</w:t>
+        <w:t>Libera un profilo: prima le strutture analizzate (segmenti, campi, occorrenze, con free_profile_parsed), poi il buffer grezzo con free_raw_buffer, che usa free() per i buffer della pseudo-classe _CDT e r_admin_freemain per lo storage restituito da R_admin.</w:t>
       </w:r>
     </w:p>
     <w:p>
@@ -9264,7 +9292,7 @@
           </w:tcPr>
           <w:p>
             <w:r>
-              <w:t>class_name</w:t>
+              <w:t>p</w:t>
             </w:r>
           </w:p>
         </w:tc>
@@ -9274,7 +9302,7 @@
           </w:tcPr>
           <w:p>
             <w:r>
-              <w:t>nome classe da verificare</w:t>
+              <w:t>profilo da liberare; azzerato al termine</w:t>
             </w:r>
           </w:p>
         </w:tc>
@@ -9288,16 +9316,43 @@
         <w:t xml:space="preserve">Valore di ritorno: </w:t>
       </w:r>
       <w:r>
-        <w:t>int — 1 se "_CDT", 0 altrimenti</w:t>
+        <w:t>void</w:t>
+      </w:r>
+    </w:p>
+    <w:p>
+      <w:r>
+        <w:rPr>
+          <w:b/>
+        </w:rPr>
+        <w:t xml:space="preserve">Note: </w:t>
+      </w:r>
+      <w:r>
+        <w:t>Richiamata da irrcdt_extract_next per liberare il profilo precedente.</w:t>
       </w:r>
     </w:p>
     <w:p/>
+    <w:p>
+      <w:pPr>
+        <w:pStyle w:val="Heading2"/>
+      </w:pPr>
+      <w:r>
+        <w:t>irrcdt.c</w:t>
+      </w:r>
+    </w:p>
+    <w:p>
+      <w:r>
+        <w:rPr>
+          <w:i/>
+        </w:rPr>
+        <w:t>Pseudo-classe "_CDT": voci della Class Descriptor Table presentate come RacseqProfile con un unico segmento "CDT".</w:t>
+      </w:r>
+    </w:p>
     <w:p>
       <w:pPr>
         <w:pStyle w:val="Heading3"/>
       </w:pPr>
       <w:r>
-        <w:t>irrcdt_extract()</w:t>
+        <w:t>irrcdt_is_pseudo_class()</w:t>
       </w:r>
     </w:p>
     <w:p>
@@ -9307,7 +9362,7 @@
           <w:i/>
           <w:sz w:val="19"/>
         </w:rPr>
-        <w:t>RacseqRC irrcdt_extract(const char *class_name_arg, RacseqProfile *out, RacseqStatus *status)</w:t>
+        <w:t>int irrcdt_is_pseudo_class(const char *class_name)</w:t>
       </w:r>
     </w:p>
     <w:p>
@@ -9329,7 +9384,7 @@
         <w:t xml:space="preserve">Scopo: </w:t>
       </w:r>
       <w:r>
-        <w:t>Legge la voce della CDT di una classe specifica (RACROUTE STAT con CLASS=) e la converte in RacseqProfile.</w:t>
+        <w:t>Indica se il nome classe richiesto corrisponde alla pseudo-classe "_CDT".</w:t>
       </w:r>
     </w:p>
     <w:p>
@@ -9390,7 +9445,7 @@
           </w:tcPr>
           <w:p>
             <w:r>
-              <w:t>class_name_arg</w:t>
+              <w:t>class_name</w:t>
             </w:r>
           </w:p>
         </w:tc>
@@ -9400,51 +9455,7 @@
           </w:tcPr>
           <w:p>
             <w:r>
-              <w:t>nome della classe RACF da cercare</w:t>
-            </w:r>
-          </w:p>
-        </w:tc>
-      </w:tr>
-      <w:tr>
-        <w:tc>
-          <w:tcPr>
-            <w:tcW w:type="dxa" w:w="1984"/>
-          </w:tcPr>
-          <w:p>
-            <w:r>
-              <w:t>out</w:t>
-            </w:r>
-          </w:p>
-        </w:tc>
-        <w:tc>
-          <w:tcPr>
-            <w:tcW w:type="dxa" w:w="7087"/>
-          </w:tcPr>
-          <w:p>
-            <w:r>
-              <w:t>profilo restituito</w:t>
-            </w:r>
-          </w:p>
-        </w:tc>
-      </w:tr>
-      <w:tr>
-        <w:tc>
-          <w:tcPr>
-            <w:tcW w:type="dxa" w:w="1984"/>
-          </w:tcPr>
-          <w:p>
-            <w:r>
-              <w:t>status</w:t>
-            </w:r>
-          </w:p>
-        </w:tc>
-        <w:tc>
-          <w:tcPr>
-            <w:tcW w:type="dxa" w:w="7087"/>
-          </w:tcPr>
-          <w:p>
-            <w:r>
-              <w:t>SAF RC, RACF RC e reason della chiamata, a solo scopo diagnostico</w:t>
+              <w:t>nome classe da verificare</w:t>
             </w:r>
           </w:p>
         </w:tc>
@@ -9458,18 +9469,7 @@
         <w:t xml:space="preserve">Valore di ritorno: </w:t>
       </w:r>
       <w:r>
-        <w:t>RacseqRC — RACSEQ_OK se la voce è stata letta, RACSEQ_ERROR in caso di errore o classe non presente nella CDT</w:t>
-      </w:r>
-    </w:p>
-    <w:p>
-      <w:r>
-        <w:rPr>
-          <w:b/>
-        </w:rPr>
-        <w:t xml:space="preserve">Note: </w:t>
-      </w:r>
-      <w:r>
-        <w:t>L'esito è deciso solo da CNSTLGT (primi 2 byte della voce, 0 = nessuna voce), non dal SAF RC: una scansione può restituire SAF RC 4 anche su voci valide.</w:t>
+        <w:t>int — 1 se "_CDT", 0 altrimenti</w:t>
       </w:r>
     </w:p>
     <w:p/>
@@ -9478,7 +9478,7 @@
         <w:pStyle w:val="Heading3"/>
       </w:pPr>
       <w:r>
-        <w:t>irrcdt_extract_next()</w:t>
+        <w:t>irrcdt_extract()</w:t>
       </w:r>
     </w:p>
     <w:p>
@@ -9488,7 +9488,7 @@
           <w:i/>
           <w:sz w:val="19"/>
         </w:rPr>
-        <w:t>RacseqRC irrcdt_extract_next(const char *start_after_name, RacseqProfile *previous, RacseqProfile *out, RacseqStatus *status)</w:t>
+        <w:t>RacseqRC irrcdt_extract(const char *class_name_arg, RacseqProfile *out, RacseqStatus *status)</w:t>
       </w:r>
     </w:p>
     <w:p>
@@ -9510,7 +9510,7 @@
         <w:t xml:space="preserve">Scopo: </w:t>
       </w:r>
       <w:r>
-        <w:t>Legge la voce successiva della CDT (RACROUTE STAT con NEXT=) partendo dall'ultima classe restituita, o dall'inizio se previous e start_after_name sono NULL.</w:t>
+        <w:t>Legge la voce della CDT di una classe specifica (RACROUTE STAT con CLASS=) e la converte in RacseqProfile.</w:t>
       </w:r>
     </w:p>
     <w:p>
@@ -9571,7 +9571,7 @@
           </w:tcPr>
           <w:p>
             <w:r>
-              <w:t>start_after_name</w:t>
+              <w:t>class_name_arg</w:t>
             </w:r>
           </w:p>
         </w:tc>
@@ -9581,7 +9581,7 @@
           </w:tcPr>
           <w:p>
             <w:r>
-              <w:t>nome della classe da cui proseguire (alternativo a previous)</w:t>
+              <w:t>nome della classe RACF da cercare</w:t>
             </w:r>
           </w:p>
         </w:tc>
@@ -9593,7 +9593,7 @@
           </w:tcPr>
           <w:p>
             <w:r>
-              <w:t>previous</w:t>
+              <w:t>out</w:t>
             </w:r>
           </w:p>
         </w:tc>
@@ -9603,7 +9603,7 @@
           </w:tcPr>
           <w:p>
             <w:r>
-              <w:t>profilo precedente, liberato internamente; può coincidere con out</w:t>
+              <w:t>profilo restituito</w:t>
             </w:r>
           </w:p>
         </w:tc>
@@ -9615,7 +9615,7 @@
           </w:tcPr>
           <w:p>
             <w:r>
-              <w:t>out</w:t>
+              <w:t>status</w:t>
             </w:r>
           </w:p>
         </w:tc>
@@ -9625,29 +9625,7 @@
           </w:tcPr>
           <w:p>
             <w:r>
-              <w:t>profilo restituito</w:t>
-            </w:r>
-          </w:p>
-        </w:tc>
-      </w:tr>
-      <w:tr>
-        <w:tc>
-          <w:tcPr>
-            <w:tcW w:type="dxa" w:w="1984"/>
-          </w:tcPr>
-          <w:p>
-            <w:r>
-              <w:t>status</w:t>
-            </w:r>
-          </w:p>
-        </w:tc>
-        <w:tc>
-          <w:tcPr>
-            <w:tcW w:type="dxa" w:w="7087"/>
-          </w:tcPr>
-          <w:p>
-            <w:r>
-              <w:t>SAF RC, RACF RC e reason, a solo scopo diagnostico</w:t>
+              <w:t>SAF RC, RACF RC e reason della chiamata, a solo scopo diagnostico</w:t>
             </w:r>
           </w:p>
         </w:tc>
@@ -9661,7 +9639,7 @@
         <w:t xml:space="preserve">Valore di ritorno: </w:t>
       </w:r>
       <w:r>
-        <w:t>RacseqRC — RACSEQ_OK, RACSEQ_NO_MORE a fine CDT, RACSEQ_ERROR se manca memoria</w:t>
+        <w:t>RacseqRC — RACSEQ_OK se la voce è stata letta, RACSEQ_ERROR in caso di errore o classe non presente nella CDT</w:t>
       </w:r>
     </w:p>
     <w:p>
@@ -9672,32 +9650,16 @@
         <w:t xml:space="preserve">Note: </w:t>
       </w:r>
       <w:r>
-        <w:t>Ogni voce è allocata con malloc insieme a un pool per i campi testuali formattati (ACTIVE, MAXLEN, DEFRC, XREF, FIRSTCH/RESTCH...) e ai flag booleani (RESGROUP, OPERATTR, PRESCASE, RACLIST, GENLIST...).</w:t>
+        <w:t>L'esito è deciso solo da CNSTLGT (primi 2 byte della voce, 0 = nessuna voce), non dal SAF RC: una scansione può restituire SAF RC 4 anche su voci valide.</w:t>
       </w:r>
     </w:p>
     <w:p/>
-    <w:p>
-      <w:pPr>
-        <w:pStyle w:val="Heading2"/>
-      </w:pPr>
-      <w:r>
-        <w:t>irrauth.c</w:t>
-      </w:r>
-    </w:p>
-    <w:p>
-      <w:r>
-        <w:rPr>
-          <w:i/>
-        </w:rPr>
-        <w:t>Verifica di autorizzazione RACF tramite RACROUTE REQUEST=AUTH.</w:t>
-      </w:r>
-    </w:p>
     <w:p>
       <w:pPr>
         <w:pStyle w:val="Heading3"/>
       </w:pPr>
       <w:r>
-        <w:t>irrauth_check_auth()</w:t>
+        <w:t>irrcdt_extract_next()</w:t>
       </w:r>
     </w:p>
     <w:p>
@@ -9707,7 +9669,7 @@
           <w:i/>
           <w:sz w:val="19"/>
         </w:rPr>
-        <w:t>int irrauth_check_auth(const char *entity_name, const char *class_name, unsigned char attr, RacauthStatus *status)</w:t>
+        <w:t>RacseqRC irrcdt_extract_next(const char *start_after_name, RacseqProfile *previous, RacseqProfile *out, RacseqStatus *status)</w:t>
       </w:r>
     </w:p>
     <w:p>
@@ -9718,7 +9680,7 @@
         <w:t xml:space="preserve">File: </w:t>
       </w:r>
       <w:r>
-        <w:t>irrauth.c</w:t>
+        <w:t>irrcdt.c</w:t>
       </w:r>
     </w:p>
     <w:p>
@@ -9729,7 +9691,7 @@
         <w:t xml:space="preserve">Scopo: </w:t>
       </w:r>
       <w:r>
-        <w:t>Allinea a sinistra e riempie di spazi entità (246 byte) e classe (8 byte) come richiesto da RACROUTE, poi richiama r_admin_check_auth.</w:t>
+        <w:t>Legge la voce successiva della CDT (RACROUTE STAT con NEXT=) partendo dall'ultima classe restituita, o dall'inizio se previous e start_after_name sono NULL.</w:t>
       </w:r>
     </w:p>
     <w:p>
@@ -9790,7 +9752,7 @@
           </w:tcPr>
           <w:p>
             <w:r>
-              <w:t>entity_name</w:t>
+              <w:t>start_after_name</w:t>
             </w:r>
           </w:p>
         </w:tc>
@@ -9800,7 +9762,7 @@
           </w:tcPr>
           <w:p>
             <w:r>
-              <w:t>nome della risorsa</w:t>
+              <w:t>nome della classe da cui proseguire (alternativo a previous)</w:t>
             </w:r>
           </w:p>
         </w:tc>
@@ -9812,7 +9774,7 @@
           </w:tcPr>
           <w:p>
             <w:r>
-              <w:t>class_name</w:t>
+              <w:t>previous</w:t>
             </w:r>
           </w:p>
         </w:tc>
@@ -9822,7 +9784,7 @@
           </w:tcPr>
           <w:p>
             <w:r>
-              <w:t>classe RACF</w:t>
+              <w:t>profilo precedente, liberato internamente; può coincidere con out</w:t>
             </w:r>
           </w:p>
         </w:tc>
@@ -9834,7 +9796,7 @@
           </w:tcPr>
           <w:p>
             <w:r>
-              <w:t>attr</w:t>
+              <w:t>out</w:t>
             </w:r>
           </w:p>
         </w:tc>
@@ -9844,7 +9806,7 @@
           </w:tcPr>
           <w:p>
             <w:r>
-              <w:t>accesso richiesto (RACAUTH_ATTR_*)</w:t>
+              <w:t>profilo restituito</w:t>
             </w:r>
           </w:p>
         </w:tc>
@@ -9866,7 +9828,7 @@
           </w:tcPr>
           <w:p>
             <w:r>
-              <w:t>se non NULL, riceve SAF RC, RACF RC e reason</w:t>
+              <w:t>SAF RC, RACF RC e reason, a solo scopo diagnostico</w:t>
             </w:r>
           </w:p>
         </w:tc>
@@ -9880,7 +9842,7 @@
         <w:t xml:space="preserve">Valore di ritorno: </w:t>
       </w:r>
       <w:r>
-        <w:t>int — SAF RC: 0 autorizzato, 4/8/12 non autorizzato</w:t>
+        <w:t>RacseqRC — RACSEQ_OK, RACSEQ_NO_MORE a fine CDT, RACSEQ_ERROR se manca memoria</w:t>
       </w:r>
     </w:p>
     <w:p>
@@ -9891,7 +9853,7 @@
         <w:t xml:space="preserve">Note: </w:t>
       </w:r>
       <w:r>
-        <w:t>Compilata ma non richiamata da smf80ext.</w:t>
+        <w:t>Ogni voce è allocata con malloc insieme a un pool per i campi testuali formattati (ACTIVE, MAXLEN, DEFRC, XREF, FIRSTCH/RESTCH...) e ai flag booleani (RESGROUP, OPERATTR, PRESCASE, RACLIST, GENLIST...).</w:t>
       </w:r>
     </w:p>
     <w:p/>
@@ -9900,7 +9862,7 @@
         <w:pStyle w:val="Heading2"/>
       </w:pPr>
       <w:r>
-        <w:t>Routine Metal C</w:t>
+        <w:t>irrauth.c</w:t>
       </w:r>
     </w:p>
     <w:p>
@@ -9908,7 +9870,7 @@
         <w:rPr>
           <w:i/>
         </w:rPr>
-        <w:t>Funzioni compilate con xlc -qmetal, richiamate dal C con linkage OS (vedi 2.3).</w:t>
+        <w:t>Verifica di autorizzazione RACF tramite RACROUTE REQUEST=AUTH.</w:t>
       </w:r>
     </w:p>
     <w:p>
@@ -9916,7 +9878,7 @@
         <w:pStyle w:val="Heading3"/>
       </w:pPr>
       <w:r>
-        <w:t>r_admin_stat_class()</w:t>
+        <w:t>irrauth_check_auth()</w:t>
       </w:r>
     </w:p>
     <w:p>
@@ -9926,7 +9888,7 @@
           <w:i/>
           <w:sz w:val="19"/>
         </w:rPr>
-        <w:t>int r_admin_stat_class(const unsigned char class_name[8], unsigned char next_name[8], unsigned char copy_area[180], RacauthStatus *status)</w:t>
+        <w:t>int irrauth_check_auth(const char *entity_name, const char *class_name, unsigned char attr, RacauthStatus *status)</w:t>
       </w:r>
     </w:p>
     <w:p>
@@ -9937,7 +9899,7 @@
         <w:t xml:space="preserve">File: </w:t>
       </w:r>
       <w:r>
-        <w:t>racstat_metal.c</w:t>
+        <w:t>irrauth.c</w:t>
       </w:r>
     </w:p>
     <w:p>
@@ -9948,7 +9910,7 @@
         <w:t xml:space="preserve">Scopo: </w:t>
       </w:r>
       <w:r>
-        <w:t>Esegue RACROUTE REQUEST=STAT: con next_name NULL legge la classe class_name (CLASS=), altrimenti la classe successiva a next_name (NEXT=), aggiornando next_name.</w:t>
+        <w:t>Allinea a sinistra e riempie di spazi entità (246 byte) e classe (8 byte) come richiesto da RACROUTE, poi richiama r_admin_check_auth.</w:t>
       </w:r>
     </w:p>
     <w:p>
@@ -10009,7 +9971,7 @@
           </w:tcPr>
           <w:p>
             <w:r>
-              <w:t>class_name</w:t>
+              <w:t>entity_name</w:t>
             </w:r>
           </w:p>
         </w:tc>
@@ -10019,7 +9981,7 @@
           </w:tcPr>
           <w:p>
             <w:r>
-              <w:t>nome classe, 8 byte riempiti di spazi</w:t>
+              <w:t>nome della risorsa</w:t>
             </w:r>
           </w:p>
         </w:tc>
@@ -10031,7 +9993,7 @@
           </w:tcPr>
           <w:p>
             <w:r>
-              <w:t>next_name</w:t>
+              <w:t>class_name</w:t>
             </w:r>
           </w:p>
         </w:tc>
@@ -10041,7 +10003,7 @@
           </w:tcPr>
           <w:p>
             <w:r>
-              <w:t>buffer di 8 byte in/out per la scansione, spazi = inizio CDT</w:t>
+              <w:t>classe RACF</w:t>
             </w:r>
           </w:p>
         </w:tc>
@@ -10053,7 +10015,7 @@
           </w:tcPr>
           <w:p>
             <w:r>
-              <w:t>copy_area</w:t>
+              <w:t>attr</w:t>
             </w:r>
           </w:p>
         </w:tc>
@@ -10063,7 +10025,7 @@
           </w:tcPr>
           <w:p>
             <w:r>
-              <w:t>riceve la voce CNST+CNSX (180 byte)</w:t>
+              <w:t>accesso richiesto (RACAUTH_ATTR_*)</w:t>
             </w:r>
           </w:p>
         </w:tc>
@@ -10085,7 +10047,7 @@
           </w:tcPr>
           <w:p>
             <w:r>
-              <w:t>SAF RC, RACF RC e reason</w:t>
+              <w:t>se non NULL, riceve SAF RC, RACF RC e reason</w:t>
             </w:r>
           </w:p>
         </w:tc>
@@ -10099,7 +10061,7 @@
         <w:t xml:space="preserve">Valore di ritorno: </w:t>
       </w:r>
       <w:r>
-        <w:t>int — SAF RC, solo informativo</w:t>
+        <w:t>int — SAF RC: 0 autorizzato, 4/8/12 non autorizzato</w:t>
       </w:r>
     </w:p>
     <w:p>
@@ -10110,16 +10072,32 @@
         <w:t xml:space="preserve">Note: </w:t>
       </w:r>
       <w:r>
-        <w:t>Nome esterno RSQFSTAT.</w:t>
+        <w:t>Compilata ma non richiamata da smf80ext.</w:t>
       </w:r>
     </w:p>
     <w:p/>
+    <w:p>
+      <w:pPr>
+        <w:pStyle w:val="Heading2"/>
+      </w:pPr>
+      <w:r>
+        <w:t>Routine Metal C</w:t>
+      </w:r>
+    </w:p>
+    <w:p>
+      <w:r>
+        <w:rPr>
+          <w:i/>
+        </w:rPr>
+        <w:t>Funzioni compilate con xlc -qmetal, richiamate dal C con linkage OS (vedi 2.3).</w:t>
+      </w:r>
+    </w:p>
     <w:p>
       <w:pPr>
         <w:pStyle w:val="Heading3"/>
       </w:pPr>
       <w:r>
-        <w:t>r_admin_check_auth()</w:t>
+        <w:t>r_admin_stat_class()</w:t>
       </w:r>
     </w:p>
     <w:p>
@@ -10129,7 +10107,7 @@
           <w:i/>
           <w:sz w:val="19"/>
         </w:rPr>
-        <w:t>int r_admin_check_auth(unsigned char entity[246], unsigned char class_name[8], racf_byte attr, RacauthStatus *status)</w:t>
+        <w:t>int r_admin_stat_class(const unsigned char class_name[8], unsigned char next_name[8], unsigned char copy_area[180], RacauthStatus *status)</w:t>
       </w:r>
     </w:p>
     <w:p>
@@ -10140,7 +10118,7 @@
         <w:t xml:space="preserve">File: </w:t>
       </w:r>
       <w:r>
-        <w:t>racauth_metal.c</w:t>
+        <w:t>racstat_metal.c</w:t>
       </w:r>
     </w:p>
     <w:p>
@@ -10151,7 +10129,7 @@
         <w:t xml:space="preserve">Scopo: </w:t>
       </w:r>
       <w:r>
-        <w:t>Esegue RACROUTE REQUEST=AUTH per l'utente corrente sulla risorsa indicata.</w:t>
+        <w:t>Esegue RACROUTE REQUEST=STAT: con next_name NULL legge la classe class_name (CLASS=), altrimenti la classe successiva a next_name (NEXT=), aggiornando next_name.</w:t>
       </w:r>
     </w:p>
     <w:p>
@@ -10212,7 +10190,7 @@
           </w:tcPr>
           <w:p>
             <w:r>
-              <w:t>entity</w:t>
+              <w:t>class_name</w:t>
             </w:r>
           </w:p>
         </w:tc>
@@ -10222,7 +10200,7 @@
           </w:tcPr>
           <w:p>
             <w:r>
-              <w:t>nome risorsa, 246 byte riempiti di spazi</w:t>
+              <w:t>nome classe, 8 byte riempiti di spazi</w:t>
             </w:r>
           </w:p>
         </w:tc>
@@ -10234,7 +10212,7 @@
           </w:tcPr>
           <w:p>
             <w:r>
-              <w:t>class_name</w:t>
+              <w:t>next_name</w:t>
             </w:r>
           </w:p>
         </w:tc>
@@ -10244,7 +10222,7 @@
           </w:tcPr>
           <w:p>
             <w:r>
-              <w:t>classe, 8 byte</w:t>
+              <w:t>buffer di 8 byte in/out per la scansione, spazi = inizio CDT</w:t>
             </w:r>
           </w:p>
         </w:tc>
@@ -10256,7 +10234,7 @@
           </w:tcPr>
           <w:p>
             <w:r>
-              <w:t>attr</w:t>
+              <w:t>copy_area</w:t>
             </w:r>
           </w:p>
         </w:tc>
@@ -10266,7 +10244,7 @@
           </w:tcPr>
           <w:p>
             <w:r>
-              <w:t>accesso richiesto</w:t>
+              <w:t>riceve la voce CNST+CNSX (180 byte)</w:t>
             </w:r>
           </w:p>
         </w:tc>
@@ -10302,7 +10280,7 @@
         <w:t xml:space="preserve">Valore di ritorno: </w:t>
       </w:r>
       <w:r>
-        <w:t>int — SAF RC (0 = autorizzato)</w:t>
+        <w:t>int — SAF RC, solo informativo</w:t>
       </w:r>
     </w:p>
     <w:p>
@@ -10313,7 +10291,7 @@
         <w:t xml:space="preserve">Note: </w:t>
       </w:r>
       <w:r>
-        <w:t>Nome esterno RSQFAUTH.</w:t>
+        <w:t>Nome esterno RSQFSTAT.</w:t>
       </w:r>
     </w:p>
     <w:p/>
@@ -10322,7 +10300,7 @@
         <w:pStyle w:val="Heading3"/>
       </w:pPr>
       <w:r>
-        <w:t>r_admin_freemain()</w:t>
+        <w:t>r_admin_check_auth()</w:t>
       </w:r>
     </w:p>
     <w:p>
@@ -10332,7 +10310,7 @@
           <w:i/>
           <w:sz w:val="19"/>
         </w:rPr>
-        <w:t>void r_admin_freemain(void *addr, unsigned int *len, unsigned int *subpool)</w:t>
+        <w:t>int r_admin_check_auth(unsigned char entity[246], unsigned char class_name[8], racf_byte attr, RacauthStatus *status)</w:t>
       </w:r>
     </w:p>
     <w:p>
@@ -10343,7 +10321,7 @@
         <w:t xml:space="preserve">File: </w:t>
       </w:r>
       <w:r>
-        <w:t>racfree_metal.c</w:t>
+        <w:t>racauth_metal.c</w:t>
       </w:r>
     </w:p>
     <w:p>
@@ -10354,7 +10332,7 @@
         <w:t xml:space="preserve">Scopo: </w:t>
       </w:r>
       <w:r>
-        <w:t>Rilascia con FREEMAIN RU lo storage restituito da R_admin.</w:t>
+        <w:t>Esegue RACROUTE REQUEST=AUTH per l'utente corrente sulla risorsa indicata.</w:t>
       </w:r>
     </w:p>
     <w:p>
@@ -10415,7 +10393,7 @@
           </w:tcPr>
           <w:p>
             <w:r>
-              <w:t>addr</w:t>
+              <w:t>entity</w:t>
             </w:r>
           </w:p>
         </w:tc>
@@ -10425,7 +10403,7 @@
           </w:tcPr>
           <w:p>
             <w:r>
-              <w:t>indirizzo dello storage</w:t>
+              <w:t>nome risorsa, 246 byte riempiti di spazi</w:t>
             </w:r>
           </w:p>
         </w:tc>
@@ -10437,7 +10415,7 @@
           </w:tcPr>
           <w:p>
             <w:r>
-              <w:t>len</w:t>
+              <w:t>class_name</w:t>
             </w:r>
           </w:p>
         </w:tc>
@@ -10447,7 +10425,7 @@
           </w:tcPr>
           <w:p>
             <w:r>
-              <w:t>puntatore alla lunghezza</w:t>
+              <w:t>classe, 8 byte</w:t>
             </w:r>
           </w:p>
         </w:tc>
@@ -10459,7 +10437,7 @@
           </w:tcPr>
           <w:p>
             <w:r>
-              <w:t>subpool</w:t>
+              <w:t>attr</w:t>
             </w:r>
           </w:p>
         </w:tc>
@@ -10469,7 +10447,29 @@
           </w:tcPr>
           <w:p>
             <w:r>
-              <w:t>puntatore al subpool</w:t>
+              <w:t>accesso richiesto</w:t>
+            </w:r>
+          </w:p>
+        </w:tc>
+      </w:tr>
+      <w:tr>
+        <w:tc>
+          <w:tcPr>
+            <w:tcW w:type="dxa" w:w="1984"/>
+          </w:tcPr>
+          <w:p>
+            <w:r>
+              <w:t>status</w:t>
+            </w:r>
+          </w:p>
+        </w:tc>
+        <w:tc>
+          <w:tcPr>
+            <w:tcW w:type="dxa" w:w="7087"/>
+          </w:tcPr>
+          <w:p>
+            <w:r>
+              <w:t>SAF RC, RACF RC e reason</w:t>
             </w:r>
           </w:p>
         </w:tc>
@@ -10483,7 +10483,7 @@
         <w:t xml:space="preserve">Valore di ritorno: </w:t>
       </w:r>
       <w:r>
-        <w:t>void</w:t>
+        <w:t>int — SAF RC (0 = autorizzato)</w:t>
       </w:r>
     </w:p>
     <w:p>
@@ -10494,7 +10494,7 @@
         <w:t xml:space="preserve">Note: </w:t>
       </w:r>
       <w:r>
-        <w:t>Nome esterno RSQFREEM. Lunghezza e subpool sono passati per indirizzo: con linkage OS i parametri scalari passano da temporanei generati dal compilatore, non affidabili.</w:t>
+        <w:t>Nome esterno RSQFAUTH.</w:t>
       </w:r>
     </w:p>
     <w:p/>
@@ -10503,7 +10503,7 @@
         <w:pStyle w:val="Heading3"/>
       </w:pPr>
       <w:r>
-        <w:t>r_admin_is_authorized()</w:t>
+        <w:t>r_admin_freemain()</w:t>
       </w:r>
     </w:p>
     <w:p>
@@ -10513,7 +10513,7 @@
           <w:i/>
           <w:sz w:val="19"/>
         </w:rPr>
-        <w:t>int r_admin_is_authorized(void)</w:t>
+        <w:t>void r_admin_freemain(void *addr, unsigned int *len, unsigned int *subpool)</w:t>
       </w:r>
     </w:p>
     <w:p>
@@ -10524,7 +10524,7 @@
         <w:t xml:space="preserve">File: </w:t>
       </w:r>
       <w:r>
-        <w:t>racmode_metal.c</w:t>
+        <w:t>racfree_metal.c</w:t>
       </w:r>
     </w:p>
     <w:p>
@@ -10535,86 +10535,7 @@
         <w:t xml:space="preserve">Scopo: </w:t>
       </w:r>
       <w:r>
-        <w:t>Verifica con TESTAUTH se il programma è APF-authorized, in supervisor state o in system key.</w:t>
-      </w:r>
-    </w:p>
-    <w:p>
-      <w:r>
-        <w:rPr>
-          <w:b/>
-        </w:rPr>
-        <w:t xml:space="preserve">Valore di ritorno: </w:t>
-      </w:r>
-      <w:r>
-        <w:t>int — 1 se autorizzato, 0 altrimenti</w:t>
-      </w:r>
-    </w:p>
-    <w:p>
-      <w:r>
-        <w:rPr>
-          <w:b/>
-        </w:rPr>
-        <w:t xml:space="preserve">Note: </w:t>
-      </w:r>
-      <w:r>
-        <w:t>Nome esterno RSQAUTH. Insieme a r_admin_enter_supervisor/r_admin_leave_supervisor (MODESET MODE=SUP/PROB, RSQENSUP/RSQLVSUP) non è richiamata da smf80ext.</w:t>
-      </w:r>
-    </w:p>
-    <w:p/>
-    <w:p>
-      <w:pPr>
-        <w:pStyle w:val="Heading2"/>
-      </w:pPr>
-      <w:r>
-        <w:t>getSez.c</w:t>
-      </w:r>
-    </w:p>
-    <w:p>
-      <w:r>
-        <w:rPr>
-          <w:i/>
-        </w:rPr>
-        <w:t>Lettura delle descrizioni delle sezioni rilocabili dei record SMF 80.</w:t>
-      </w:r>
-    </w:p>
-    <w:p>
-      <w:pPr>
-        <w:pStyle w:val="Heading3"/>
-      </w:pPr>
-      <w:r>
-        <w:t>getSez()</w:t>
-      </w:r>
-    </w:p>
-    <w:p>
-      <w:r>
-        <w:rPr>
-          <w:rFonts w:ascii="Consolas" w:hAnsi="Consolas"/>
-          <w:i/>
-          <w:sz w:val="19"/>
-        </w:rPr>
-        <w:t>st_sm80_sez *getSez(char *filename, char *member)</w:t>
-      </w:r>
-    </w:p>
-    <w:p>
-      <w:r>
-        <w:rPr>
-          <w:b/>
-        </w:rPr>
-        <w:t xml:space="preserve">File: </w:t>
-      </w:r>
-      <w:r>
-        <w:t>getSez.c</w:t>
-      </w:r>
-    </w:p>
-    <w:p>
-      <w:r>
-        <w:rPr>
-          <w:b/>
-        </w:rPr>
-        <w:t xml:space="preserve">Scopo: </w:t>
-      </w:r>
-      <w:r>
-        <w:t>Legge il membro PDS (tipicamente SM80REL) con numero e descrizione di ciascuna sezione rilocabile, costruendo la relativa linked list usata per arricchire il dump esadecimale (smf80dmp) con la descrizione di ogni sezione trovata.</w:t>
+        <w:t>Rilascia con FREEMAIN RU lo storage restituito da R_admin.</w:t>
       </w:r>
     </w:p>
     <w:p>
@@ -10675,7 +10596,7 @@
           </w:tcPr>
           <w:p>
             <w:r>
-              <w:t>filename</w:t>
+              <w:t>addr</w:t>
             </w:r>
           </w:p>
         </w:tc>
@@ -10685,7 +10606,7 @@
           </w:tcPr>
           <w:p>
             <w:r>
-              <w:t>DD o path del PDS di controllo</w:t>
+              <w:t>indirizzo dello storage</w:t>
             </w:r>
           </w:p>
         </w:tc>
@@ -10697,7 +10618,7 @@
           </w:tcPr>
           <w:p>
             <w:r>
-              <w:t>member</w:t>
+              <w:t>len</w:t>
             </w:r>
           </w:p>
         </w:tc>
@@ -10707,7 +10628,29 @@
           </w:tcPr>
           <w:p>
             <w:r>
-              <w:t>nome del membro da leggere ("SM80REL")</w:t>
+              <w:t>puntatore alla lunghezza</w:t>
+            </w:r>
+          </w:p>
+        </w:tc>
+      </w:tr>
+      <w:tr>
+        <w:tc>
+          <w:tcPr>
+            <w:tcW w:type="dxa" w:w="1984"/>
+          </w:tcPr>
+          <w:p>
+            <w:r>
+              <w:t>subpool</w:t>
+            </w:r>
+          </w:p>
+        </w:tc>
+        <w:tc>
+          <w:tcPr>
+            <w:tcW w:type="dxa" w:w="7087"/>
+          </w:tcPr>
+          <w:p>
+            <w:r>
+              <w:t>puntatore al subpool</w:t>
             </w:r>
           </w:p>
         </w:tc>
@@ -10721,7 +10664,7 @@
         <w:t xml:space="preserve">Valore di ritorno: </w:t>
       </w:r>
       <w:r>
-        <w:t>st_sm80_sez* — radice della linked list delle sezioni</w:t>
+        <w:t>void</w:t>
       </w:r>
     </w:p>
     <w:p>
@@ -10732,7 +10675,7 @@
         <w:t xml:space="preserve">Note: </w:t>
       </w:r>
       <w:r>
-        <w:t>Termina il programma (exit(4)) se il file non può essere aperto.</w:t>
+        <w:t>Nome esterno RSQFREEM. Lunghezza e subpool sono passati per indirizzo: con linkage OS i parametri scalari passano da temporanei generati dal compilatore, non affidabili.</w:t>
       </w:r>
     </w:p>
     <w:p/>
@@ -10741,7 +10684,7 @@
         <w:pStyle w:val="Heading3"/>
       </w:pPr>
       <w:r>
-        <w:t>push_sez()</w:t>
+        <w:t>r_admin_is_authorized()</w:t>
       </w:r>
     </w:p>
     <w:p>
@@ -10751,7 +10694,7 @@
           <w:i/>
           <w:sz w:val="19"/>
         </w:rPr>
-        <w:t>void push_sez(const int numb, char *desc)</w:t>
+        <w:t>int r_admin_is_authorized(void)</w:t>
       </w:r>
     </w:p>
     <w:p>
@@ -10762,18 +10705,97 @@
         <w:t xml:space="preserve">File: </w:t>
       </w:r>
       <w:r>
+        <w:t>racmode_metal.c</w:t>
+      </w:r>
+    </w:p>
+    <w:p>
+      <w:r>
+        <w:rPr>
+          <w:b/>
+        </w:rPr>
+        <w:t xml:space="preserve">Scopo: </w:t>
+      </w:r>
+      <w:r>
+        <w:t>Verifica con TESTAUTH se il programma è APF-authorized, in supervisor state o in system key.</w:t>
+      </w:r>
+    </w:p>
+    <w:p>
+      <w:r>
+        <w:rPr>
+          <w:b/>
+        </w:rPr>
+        <w:t xml:space="preserve">Valore di ritorno: </w:t>
+      </w:r>
+      <w:r>
+        <w:t>int — 1 se autorizzato, 0 altrimenti</w:t>
+      </w:r>
+    </w:p>
+    <w:p>
+      <w:r>
+        <w:rPr>
+          <w:b/>
+        </w:rPr>
+        <w:t xml:space="preserve">Note: </w:t>
+      </w:r>
+      <w:r>
+        <w:t>Nome esterno RSQAUTH. Insieme a r_admin_enter_supervisor/r_admin_leave_supervisor (MODESET MODE=SUP/PROB, RSQENSUP/RSQLVSUP) non è richiamata da smf80ext.</w:t>
+      </w:r>
+    </w:p>
+    <w:p/>
+    <w:p>
+      <w:pPr>
+        <w:pStyle w:val="Heading2"/>
+      </w:pPr>
+      <w:r>
         <w:t>getSez.c</w:t>
       </w:r>
     </w:p>
     <w:p>
       <w:r>
         <w:rPr>
+          <w:i/>
+        </w:rPr>
+        <w:t>Lettura delle descrizioni delle sezioni rilocabili dei record SMF 80.</w:t>
+      </w:r>
+    </w:p>
+    <w:p>
+      <w:pPr>
+        <w:pStyle w:val="Heading3"/>
+      </w:pPr>
+      <w:r>
+        <w:t>getSez()</w:t>
+      </w:r>
+    </w:p>
+    <w:p>
+      <w:r>
+        <w:rPr>
+          <w:rFonts w:ascii="Consolas" w:hAnsi="Consolas"/>
+          <w:i/>
+          <w:sz w:val="19"/>
+        </w:rPr>
+        <w:t>st_sm80_sez *getSez(char *filename, char *member)</w:t>
+      </w:r>
+    </w:p>
+    <w:p>
+      <w:r>
+        <w:rPr>
           <w:b/>
         </w:rPr>
+        <w:t xml:space="preserve">File: </w:t>
+      </w:r>
+      <w:r>
+        <w:t>getSez.c</w:t>
+      </w:r>
+    </w:p>
+    <w:p>
+      <w:r>
+        <w:rPr>
+          <w:b/>
+        </w:rPr>
         <w:t xml:space="preserve">Scopo: </w:t>
       </w:r>
       <w:r>
-        <w:t>Accoda un nuovo nodo sezione, mantenendo l'ordine di lettura, in fondo alla linked list globale root_sez.</w:t>
+        <w:t>Legge il membro PDS (tipicamente SM80REL) con numero e descrizione di ciascuna sezione rilocabile, costruendo la relativa linked list usata per arricchire il dump esadecimale (smf80dmp) con la descrizione di ogni sezione trovata.</w:t>
       </w:r>
     </w:p>
     <w:p>
@@ -10834,7 +10856,7 @@
           </w:tcPr>
           <w:p>
             <w:r>
-              <w:t>numb</w:t>
+              <w:t>filename</w:t>
             </w:r>
           </w:p>
         </w:tc>
@@ -10844,7 +10866,7 @@
           </w:tcPr>
           <w:p>
             <w:r>
-              <w:t>numero della sezione rilocabile</w:t>
+              <w:t>DD o path del PDS di controllo</w:t>
             </w:r>
           </w:p>
         </w:tc>
@@ -10856,7 +10878,7 @@
           </w:tcPr>
           <w:p>
             <w:r>
-              <w:t>desc</w:t>
+              <w:t>member</w:t>
             </w:r>
           </w:p>
         </w:tc>
@@ -10866,7 +10888,7 @@
           </w:tcPr>
           <w:p>
             <w:r>
-              <w:t>descrizione della sezione</w:t>
+              <w:t>nome del membro da leggere ("SM80REL")</w:t>
             </w:r>
           </w:p>
         </w:tc>
@@ -10880,7 +10902,7 @@
         <w:t xml:space="preserve">Valore di ritorno: </w:t>
       </w:r>
       <w:r>
-        <w:t>void</w:t>
+        <w:t>st_sm80_sez* — radice della linked list delle sezioni</w:t>
       </w:r>
     </w:p>
     <w:p>
@@ -10891,32 +10913,16 @@
         <w:t xml:space="preserve">Note: </w:t>
       </w:r>
       <w:r>
-        <w:t>Funzione di supporto interna a getSez; la lista risultante è ordinata per numero crescente (il file di input è atteso ordinato), sfruttato da findsez per uscire anticipatamente dalla ricerca.</w:t>
+        <w:t>Termina il programma (exit(4)) se il file non può essere aperto.</w:t>
       </w:r>
     </w:p>
     <w:p/>
-    <w:p>
-      <w:pPr>
-        <w:pStyle w:val="Heading2"/>
-      </w:pPr>
-      <w:r>
-        <w:t>makeargv.c</w:t>
-      </w:r>
-    </w:p>
-    <w:p>
-      <w:r>
-        <w:rPr>
-          <w:i/>
-        </w:rPr>
-        <w:t>Tokenizzazione di una stringa con spazio come separatore.</w:t>
-      </w:r>
-    </w:p>
     <w:p>
       <w:pPr>
         <w:pStyle w:val="Heading3"/>
       </w:pPr>
       <w:r>
-        <w:t>makeargv()</w:t>
+        <w:t>push_sez()</w:t>
       </w:r>
     </w:p>
     <w:p>
@@ -10926,7 +10932,7 @@
           <w:i/>
           <w:sz w:val="19"/>
         </w:rPr>
-        <w:t>int makeargv(char *string, char *argv[], int argvsize, int max_argc)</w:t>
+        <w:t>void push_sez(const int numb, char *desc)</w:t>
       </w:r>
     </w:p>
     <w:p>
@@ -10937,7 +10943,7 @@
         <w:t xml:space="preserve">File: </w:t>
       </w:r>
       <w:r>
-        <w:t>makeargv.c</w:t>
+        <w:t>getSez.c</w:t>
       </w:r>
     </w:p>
     <w:p>
@@ -10948,7 +10954,7 @@
         <w:t xml:space="preserve">Scopo: </w:t>
       </w:r>
       <w:r>
-        <w:t>Suddivide la stringa in token separati da blank, popolando l'array argv. Se max_argc è diverso da 0, i primi (max_argc-1) token sono estratti singolarmente e l'ultimo token contiene il resto della stringa non ancora tokenizzata (utile per estrarre 'caratteristica operatore &lt;resto della lista valori&gt;').</w:t>
+        <w:t>Accoda un nuovo nodo sezione, mantenendo l'ordine di lettura, in fondo alla linked list globale root_sez.</w:t>
       </w:r>
     </w:p>
     <w:p>
@@ -11009,7 +11015,7 @@
           </w:tcPr>
           <w:p>
             <w:r>
-              <w:t>string</w:t>
+              <w:t>numb</w:t>
             </w:r>
           </w:p>
         </w:tc>
@@ -11019,7 +11025,7 @@
           </w:tcPr>
           <w:p>
             <w:r>
-              <w:t>stringa da tokenizzare (modificata in place: gli spazi separatori diventano '\0')</w:t>
+              <w:t>numero della sezione rilocabile</w:t>
             </w:r>
           </w:p>
         </w:tc>
@@ -11031,7 +11037,7 @@
           </w:tcPr>
           <w:p>
             <w:r>
-              <w:t>argv</w:t>
+              <w:t>desc</w:t>
             </w:r>
           </w:p>
         </w:tc>
@@ -11041,51 +11047,7 @@
           </w:tcPr>
           <w:p>
             <w:r>
-              <w:t>array di puntatori di output, un elemento per token</w:t>
-            </w:r>
-          </w:p>
-        </w:tc>
-      </w:tr>
-      <w:tr>
-        <w:tc>
-          <w:tcPr>
-            <w:tcW w:type="dxa" w:w="1984"/>
-          </w:tcPr>
-          <w:p>
-            <w:r>
-              <w:t>argvsize</w:t>
-            </w:r>
-          </w:p>
-        </w:tc>
-        <w:tc>
-          <w:tcPr>
-            <w:tcW w:type="dxa" w:w="7087"/>
-          </w:tcPr>
-          <w:p>
-            <w:r>
-              <w:t>dimensione massima dell'array argv</w:t>
-            </w:r>
-          </w:p>
-        </w:tc>
-      </w:tr>
-      <w:tr>
-        <w:tc>
-          <w:tcPr>
-            <w:tcW w:type="dxa" w:w="1984"/>
-          </w:tcPr>
-          <w:p>
-            <w:r>
-              <w:t>max_argc</w:t>
-            </w:r>
-          </w:p>
-        </w:tc>
-        <w:tc>
-          <w:tcPr>
-            <w:tcW w:type="dxa" w:w="7087"/>
-          </w:tcPr>
-          <w:p>
-            <w:r>
-              <w:t>numero di token oltre i quali il resto viene considerato un unico token (0 = nessun limite)</w:t>
+              <w:t>descrizione della sezione</w:t>
             </w:r>
           </w:p>
         </w:tc>
@@ -11099,7 +11061,18 @@
         <w:t xml:space="preserve">Valore di ritorno: </w:t>
       </w:r>
       <w:r>
-        <w:t>int — numero di token estratti (argc)</w:t>
+        <w:t>void</w:t>
+      </w:r>
+    </w:p>
+    <w:p>
+      <w:r>
+        <w:rPr>
+          <w:b/>
+        </w:rPr>
+        <w:t xml:space="preserve">Note: </w:t>
+      </w:r>
+      <w:r>
+        <w:t>Funzione di supporto interna a getSez; la lista risultante è ordinata per numero crescente (il file di input è atteso ordinato), sfruttato da findsez per uscire anticipatamente dalla ricerca.</w:t>
       </w:r>
     </w:p>
     <w:p/>
@@ -11108,7 +11081,7 @@
         <w:pStyle w:val="Heading2"/>
       </w:pPr>
       <w:r>
-        <w:t>crfilter.c</w:t>
+        <w:t>makeargv.c</w:t>
       </w:r>
     </w:p>
     <w:p>
@@ -11116,7 +11089,7 @@
         <w:rPr>
           <w:i/>
         </w:rPr>
-        <w:t>Costruttore della linked list dei filtri collegati a un parametro.</w:t>
+        <w:t>Tokenizzazione di una stringa con spazio come separatore.</w:t>
       </w:r>
     </w:p>
     <w:p>
@@ -11124,7 +11097,7 @@
         <w:pStyle w:val="Heading3"/>
       </w:pPr>
       <w:r>
-        <w:t>crfilter()</w:t>
+        <w:t>makeargv()</w:t>
       </w:r>
     </w:p>
     <w:p>
@@ -11134,7 +11107,7 @@
           <w:i/>
           <w:sz w:val="19"/>
         </w:rPr>
-        <w:t>list_filter *crfilter(uint32_t value, char *name, char *desc)</w:t>
+        <w:t>int makeargv(char *string, char *argv[], int argvsize, int max_argc)</w:t>
       </w:r>
     </w:p>
     <w:p>
@@ -11145,7 +11118,7 @@
         <w:t xml:space="preserve">File: </w:t>
       </w:r>
       <w:r>
-        <w:t>crfilter.c</w:t>
+        <w:t>makeargv.c</w:t>
       </w:r>
     </w:p>
     <w:p>
@@ -11156,7 +11129,7 @@
         <w:t xml:space="preserve">Scopo: </w:t>
       </w:r>
       <w:r>
-        <w:t>Alloca e popola un nodo filtro (valore numerico opzionale, nome testuale, descrizione opzionale) da agganciare alla lista dei filtri di un parametro.</w:t>
+        <w:t>Suddivide la stringa in token separati da blank, popolando l'array argv. Se max_argc è diverso da 0, i primi (max_argc-1) token sono estratti singolarmente e l'ultimo token contiene il resto della stringa non ancora tokenizzata (utile per estrarre 'caratteristica operatore &lt;resto della lista valori&gt;').</w:t>
       </w:r>
     </w:p>
     <w:p>
@@ -11217,7 +11190,7 @@
           </w:tcPr>
           <w:p>
             <w:r>
-              <w:t>value</w:t>
+              <w:t>string</w:t>
             </w:r>
           </w:p>
         </w:tc>
@@ -11227,7 +11200,7 @@
           </w:tcPr>
           <w:p>
             <w:r>
-              <w:t>valore numerico del filtro (se applicabile)</w:t>
+              <w:t>stringa da tokenizzare (modificata in place: gli spazi separatori diventano '\0')</w:t>
             </w:r>
           </w:p>
         </w:tc>
@@ -11239,7 +11212,7 @@
           </w:tcPr>
           <w:p>
             <w:r>
-              <w:t>name</w:t>
+              <w:t>argv</w:t>
             </w:r>
           </w:p>
         </w:tc>
@@ -11249,7 +11222,7 @@
           </w:tcPr>
           <w:p>
             <w:r>
-              <w:t>valore testuale del filtro come fornito da input</w:t>
+              <w:t>array di puntatori di output, un elemento per token</w:t>
             </w:r>
           </w:p>
         </w:tc>
@@ -11261,7 +11234,7 @@
           </w:tcPr>
           <w:p>
             <w:r>
-              <w:t>desc</w:t>
+              <w:t>argvsize</w:t>
             </w:r>
           </w:p>
         </w:tc>
@@ -11271,7 +11244,29 @@
           </w:tcPr>
           <w:p>
             <w:r>
-              <w:t>descrizione opzionale (NULL se non ancora nota, valorizzata poi da chkparm)</w:t>
+              <w:t>dimensione massima dell'array argv</w:t>
+            </w:r>
+          </w:p>
+        </w:tc>
+      </w:tr>
+      <w:tr>
+        <w:tc>
+          <w:tcPr>
+            <w:tcW w:type="dxa" w:w="1984"/>
+          </w:tcPr>
+          <w:p>
+            <w:r>
+              <w:t>max_argc</w:t>
+            </w:r>
+          </w:p>
+        </w:tc>
+        <w:tc>
+          <w:tcPr>
+            <w:tcW w:type="dxa" w:w="7087"/>
+          </w:tcPr>
+          <w:p>
+            <w:r>
+              <w:t>numero di token oltre i quali il resto viene considerato un unico token (0 = nessun limite)</w:t>
             </w:r>
           </w:p>
         </w:tc>
@@ -11285,7 +11280,7 @@
         <w:t xml:space="preserve">Valore di ritorno: </w:t>
       </w:r>
       <w:r>
-        <w:t>list_filter* — puntatore al nuovo nodo (next = NULL)</w:t>
+        <w:t>int — numero di token estratti (argc)</w:t>
       </w:r>
     </w:p>
     <w:p/>
@@ -11294,7 +11289,7 @@
         <w:pStyle w:val="Heading2"/>
       </w:pPr>
       <w:r>
-        <w:t>crparm.c</w:t>
+        <w:t>crfilter.c</w:t>
       </w:r>
     </w:p>
     <w:p>
@@ -11302,7 +11297,7 @@
         <w:rPr>
           <w:i/>
         </w:rPr>
-        <w:t>Costruttore della linked list dei parametri di input, e relativa ricerca.</w:t>
+        <w:t>Costruttore della linked list dei filtri collegati a un parametro.</w:t>
       </w:r>
     </w:p>
     <w:p>
@@ -11310,7 +11305,7 @@
         <w:pStyle w:val="Heading3"/>
       </w:pPr>
       <w:r>
-        <w:t>crparm()</w:t>
+        <w:t>crfilter()</w:t>
       </w:r>
     </w:p>
     <w:p>
@@ -11320,7 +11315,7 @@
           <w:i/>
           <w:sz w:val="19"/>
         </w:rPr>
-        <w:t>list_parameter *crparm(char *name, int num, char *oper, uint8_t opnum, char *desc)</w:t>
+        <w:t>list_filter *crfilter(uint32_t value, char *name, char *desc)</w:t>
       </w:r>
     </w:p>
     <w:p>
@@ -11331,7 +11326,7 @@
         <w:t xml:space="preserve">File: </w:t>
       </w:r>
       <w:r>
-        <w:t>crparm.c</w:t>
+        <w:t>crfilter.c</w:t>
       </w:r>
     </w:p>
     <w:p>
@@ -11342,7 +11337,7 @@
         <w:t xml:space="preserve">Scopo: </w:t>
       </w:r>
       <w:r>
-        <w:t>Alloca e popola un nodo parametro (caratteristica) con nome, codice interno, operatore testuale/numerico e tipo di filtro associato (da tabella l_parm_num).</w:t>
+        <w:t>Alloca e popola un nodo filtro (valore numerico opzionale, nome testuale, descrizione opzionale) da agganciare alla lista dei filtri di un parametro.</w:t>
       </w:r>
     </w:p>
     <w:p>
@@ -11403,7 +11398,7 @@
           </w:tcPr>
           <w:p>
             <w:r>
-              <w:t>name</w:t>
+              <w:t>value</w:t>
             </w:r>
           </w:p>
         </w:tc>
@@ -11413,7 +11408,7 @@
           </w:tcPr>
           <w:p>
             <w:r>
-              <w:t>nome della caratteristica (es. EVENT, CLASS...)</w:t>
+              <w:t>valore numerico del filtro (se applicabile)</w:t>
             </w:r>
           </w:p>
         </w:tc>
@@ -11425,7 +11420,7 @@
           </w:tcPr>
           <w:p>
             <w:r>
-              <w:t>num</w:t>
+              <w:t>name</w:t>
             </w:r>
           </w:p>
         </w:tc>
@@ -11435,7 +11430,7 @@
           </w:tcPr>
           <w:p>
             <w:r>
-              <w:t>codice interno posizionale della caratteristica</w:t>
+              <w:t>valore testuale del filtro come fornito da input</w:t>
             </w:r>
           </w:p>
         </w:tc>
@@ -11447,7 +11442,7 @@
           </w:tcPr>
           <w:p>
             <w:r>
-              <w:t>oper</w:t>
+              <w:t>desc</w:t>
             </w:r>
           </w:p>
         </w:tc>
@@ -11457,51 +11452,7 @@
           </w:tcPr>
           <w:p>
             <w:r>
-              <w:t>operatore testuale (=, &lt;&gt;, ABR)</w:t>
-            </w:r>
-          </w:p>
-        </w:tc>
-      </w:tr>
-      <w:tr>
-        <w:tc>
-          <w:tcPr>
-            <w:tcW w:type="dxa" w:w="1984"/>
-          </w:tcPr>
-          <w:p>
-            <w:r>
-              <w:t>opnum</w:t>
-            </w:r>
-          </w:p>
-        </w:tc>
-        <w:tc>
-          <w:tcPr>
-            <w:tcW w:type="dxa" w:w="7087"/>
-          </w:tcPr>
-          <w:p>
-            <w:r>
-              <w:t>codice interno dell'operatore</w:t>
-            </w:r>
-          </w:p>
-        </w:tc>
-      </w:tr>
-      <w:tr>
-        <w:tc>
-          <w:tcPr>
-            <w:tcW w:type="dxa" w:w="1984"/>
-          </w:tcPr>
-          <w:p>
-            <w:r>
-              <w:t>desc</w:t>
-            </w:r>
-          </w:p>
-        </w:tc>
-        <w:tc>
-          <w:tcPr>
-            <w:tcW w:type="dxa" w:w="7087"/>
-          </w:tcPr>
-          <w:p>
-            <w:r>
-              <w:t>descrizione opzionale</w:t>
+              <w:t>descrizione opzionale (NULL se non ancora nota, valorizzata poi da chkparm)</w:t>
             </w:r>
           </w:p>
         </w:tc>
@@ -11515,16 +11466,32 @@
         <w:t xml:space="preserve">Valore di ritorno: </w:t>
       </w:r>
       <w:r>
-        <w:t>list_parameter* — puntatore al nuovo nodo (param_filter = NULL, next = NULL)</w:t>
+        <w:t>list_filter* — puntatore al nuovo nodo (next = NULL)</w:t>
       </w:r>
     </w:p>
     <w:p/>
+    <w:p>
+      <w:pPr>
+        <w:pStyle w:val="Heading2"/>
+      </w:pPr>
+      <w:r>
+        <w:t>crparm.c</w:t>
+      </w:r>
+    </w:p>
+    <w:p>
+      <w:r>
+        <w:rPr>
+          <w:i/>
+        </w:rPr>
+        <w:t>Costruttore della linked list dei parametri di input, e relativa ricerca.</w:t>
+      </w:r>
+    </w:p>
     <w:p>
       <w:pPr>
         <w:pStyle w:val="Heading3"/>
       </w:pPr>
       <w:r>
-        <w:t>findparm()</w:t>
+        <w:t>crparm()</w:t>
       </w:r>
     </w:p>
     <w:p>
@@ -11534,7 +11501,7 @@
           <w:i/>
           <w:sz w:val="19"/>
         </w:rPr>
-        <w:t>list_parameter *findparm(char *name, uint8_t num, list_parameter *root_parameter)</w:t>
+        <w:t>list_parameter *crparm(char *name, int num, char *oper, uint8_t opnum, char *desc)</w:t>
       </w:r>
     </w:p>
     <w:p>
@@ -11556,7 +11523,7 @@
         <w:t xml:space="preserve">Scopo: </w:t>
       </w:r>
       <w:r>
-        <w:t>Cerca nella linked list dei parametri il nodo con nome o numero corrispondente.</w:t>
+        <w:t>Alloca e popola un nodo parametro (caratteristica) con nome, codice interno, operatore testuale/numerico e tipo di filtro associato (da tabella l_parm_num).</w:t>
       </w:r>
     </w:p>
     <w:p>
@@ -11627,7 +11594,7 @@
           </w:tcPr>
           <w:p>
             <w:r>
-              <w:t>nome da cercare (se non NULL, la ricerca è per nome)</w:t>
+              <w:t>nome della caratteristica (es. EVENT, CLASS...)</w:t>
             </w:r>
           </w:p>
         </w:tc>
@@ -11649,7 +11616,7 @@
           </w:tcPr>
           <w:p>
             <w:r>
-              <w:t>codice numerico da cercare (usato se name è NULL)</w:t>
+              <w:t>codice interno posizionale della caratteristica</w:t>
             </w:r>
           </w:p>
         </w:tc>
@@ -11661,7 +11628,7 @@
           </w:tcPr>
           <w:p>
             <w:r>
-              <w:t>root_parameter</w:t>
+              <w:t>oper</w:t>
             </w:r>
           </w:p>
         </w:tc>
@@ -11671,7 +11638,51 @@
           </w:tcPr>
           <w:p>
             <w:r>
-              <w:t>radice della lista da scorrere</w:t>
+              <w:t>operatore testuale (=, &lt;&gt;, ABR)</w:t>
+            </w:r>
+          </w:p>
+        </w:tc>
+      </w:tr>
+      <w:tr>
+        <w:tc>
+          <w:tcPr>
+            <w:tcW w:type="dxa" w:w="1984"/>
+          </w:tcPr>
+          <w:p>
+            <w:r>
+              <w:t>opnum</w:t>
+            </w:r>
+          </w:p>
+        </w:tc>
+        <w:tc>
+          <w:tcPr>
+            <w:tcW w:type="dxa" w:w="7087"/>
+          </w:tcPr>
+          <w:p>
+            <w:r>
+              <w:t>codice interno dell'operatore</w:t>
+            </w:r>
+          </w:p>
+        </w:tc>
+      </w:tr>
+      <w:tr>
+        <w:tc>
+          <w:tcPr>
+            <w:tcW w:type="dxa" w:w="1984"/>
+          </w:tcPr>
+          <w:p>
+            <w:r>
+              <w:t>desc</w:t>
+            </w:r>
+          </w:p>
+        </w:tc>
+        <w:tc>
+          <w:tcPr>
+            <w:tcW w:type="dxa" w:w="7087"/>
+          </w:tcPr>
+          <w:p>
+            <w:r>
+              <w:t>descrizione opzionale</w:t>
             </w:r>
           </w:p>
         </w:tc>
@@ -11685,43 +11696,16 @@
         <w:t xml:space="preserve">Valore di ritorno: </w:t>
       </w:r>
       <w:r>
-        <w:t>list_parameter* — nodo trovato, o NULL</w:t>
-      </w:r>
-    </w:p>
-    <w:p>
-      <w:r>
-        <w:rPr>
-          <w:b/>
-        </w:rPr>
-        <w:t xml:space="preserve">Note: </w:t>
-      </w:r>
-      <w:r>
-        <w:t>⚠ Il ciclo while non avanza il puntatore p quando la condizione di ricerca non è soddisfatta: la funzione non è attualmente richiamata da alcun altro modulo del progetto.</w:t>
+        <w:t>list_parameter* — puntatore al nuovo nodo (param_filter = NULL, next = NULL)</w:t>
       </w:r>
     </w:p>
     <w:p/>
-    <w:p>
-      <w:pPr>
-        <w:pStyle w:val="Heading2"/>
-      </w:pPr>
-      <w:r>
-        <w:t>getlrow.c</w:t>
-      </w:r>
-    </w:p>
-    <w:p>
-      <w:r>
-        <w:rPr>
-          <w:i/>
-        </w:rPr>
-        <w:t>Ricostruzione di una riga logica di parametri, concatenando le righe continuate con '+'.</w:t>
-      </w:r>
-    </w:p>
     <w:p>
       <w:pPr>
         <w:pStyle w:val="Heading3"/>
       </w:pPr>
       <w:r>
-        <w:t>getlrow()</w:t>
+        <w:t>findparm()</w:t>
       </w:r>
     </w:p>
     <w:p>
@@ -11731,7 +11715,7 @@
           <w:i/>
           <w:sz w:val="19"/>
         </w:rPr>
-        <w:t>char *getlrow(char *buff, FILE *parm)</w:t>
+        <w:t>list_parameter *findparm(char *name, uint8_t num, list_parameter *root_parameter)</w:t>
       </w:r>
     </w:p>
     <w:p>
@@ -11742,7 +11726,7 @@
         <w:t xml:space="preserve">File: </w:t>
       </w:r>
       <w:r>
-        <w:t>getlrow.c</w:t>
+        <w:t>crparm.c</w:t>
       </w:r>
     </w:p>
     <w:p>
@@ -11753,7 +11737,7 @@
         <w:t xml:space="preserve">Scopo: </w:t>
       </w:r>
       <w:r>
-        <w:t>Legge una riga fisica dal file dei parametri; se termina (spazi esclusi) con il carattere '+', continua a leggere e concatenare le righe successive (ignorando quelle che iniziano per '*', considerate commento) finché non trova una riga che non richiede continuazione. Segnala l'EOF restituendo una stringa vuota.</w:t>
+        <w:t>Cerca nella linked list dei parametri il nodo con nome o numero corrispondente.</w:t>
       </w:r>
     </w:p>
     <w:p>
@@ -11814,7 +11798,7 @@
           </w:tcPr>
           <w:p>
             <w:r>
-              <w:t>buff</w:t>
+              <w:t>name</w:t>
             </w:r>
           </w:p>
         </w:tc>
@@ -11824,7 +11808,7 @@
           </w:tcPr>
           <w:p>
             <w:r>
-              <w:t>buffer riallocabile in cui viene restituita la riga logica completa</w:t>
+              <w:t>nome da cercare (se non NULL, la ricerca è per nome)</w:t>
             </w:r>
           </w:p>
         </w:tc>
@@ -11836,7 +11820,7 @@
           </w:tcPr>
           <w:p>
             <w:r>
-              <w:t>parm</w:t>
+              <w:t>num</w:t>
             </w:r>
           </w:p>
         </w:tc>
@@ -11846,7 +11830,29 @@
           </w:tcPr>
           <w:p>
             <w:r>
-              <w:t>file handle del file dei parametri (DD:UTIPARM)</w:t>
+              <w:t>codice numerico da cercare (usato se name è NULL)</w:t>
+            </w:r>
+          </w:p>
+        </w:tc>
+      </w:tr>
+      <w:tr>
+        <w:tc>
+          <w:tcPr>
+            <w:tcW w:type="dxa" w:w="1984"/>
+          </w:tcPr>
+          <w:p>
+            <w:r>
+              <w:t>root_parameter</w:t>
+            </w:r>
+          </w:p>
+        </w:tc>
+        <w:tc>
+          <w:tcPr>
+            <w:tcW w:type="dxa" w:w="7087"/>
+          </w:tcPr>
+          <w:p>
+            <w:r>
+              <w:t>radice della lista da scorrere</w:t>
             </w:r>
           </w:p>
         </w:tc>
@@ -11860,7 +11866,7 @@
         <w:t xml:space="preserve">Valore di ritorno: </w:t>
       </w:r>
       <w:r>
-        <w:t>char* — buff riallocato con la riga logica (stringa vuota a EOF)</w:t>
+        <w:t>list_parameter* — nodo trovato, o NULL</w:t>
       </w:r>
     </w:p>
     <w:p>
@@ -11871,16 +11877,32 @@
         <w:t xml:space="preserve">Note: </w:t>
       </w:r>
       <w:r>
-        <w:t>Termina il programma (exit(8)) se viene richiesta una continuazione ma si incontra EOF prima di trovarla.</w:t>
+        <w:t>⚠ Il ciclo while non avanza il puntatore p quando la condizione di ricerca non è soddisfatta: la funzione non è attualmente richiamata da alcun altro modulo del progetto.</w:t>
       </w:r>
     </w:p>
     <w:p/>
+    <w:p>
+      <w:pPr>
+        <w:pStyle w:val="Heading2"/>
+      </w:pPr>
+      <w:r>
+        <w:t>getlrow.c</w:t>
+      </w:r>
+    </w:p>
+    <w:p>
+      <w:r>
+        <w:rPr>
+          <w:i/>
+        </w:rPr>
+        <w:t>Ricostruzione di una riga logica di parametri, concatenando le righe continuate con '+'.</w:t>
+      </w:r>
+    </w:p>
     <w:p>
       <w:pPr>
         <w:pStyle w:val="Heading3"/>
       </w:pPr>
       <w:r>
-        <w:t>continua()</w:t>
+        <w:t>getlrow()</w:t>
       </w:r>
     </w:p>
     <w:p>
@@ -11890,7 +11912,7 @@
           <w:i/>
           <w:sz w:val="19"/>
         </w:rPr>
-        <w:t>static int continua(char *str)</w:t>
+        <w:t>char *getlrow(char *buff, FILE *parm)</w:t>
       </w:r>
     </w:p>
     <w:p>
@@ -11912,7 +11934,7 @@
         <w:t xml:space="preserve">Scopo: </w:t>
       </w:r>
       <w:r>
-        <w:t>Verifica se la riga richiede continuazione: scandisce la stringa dalla fine ignorando gli spazi, e se trova '+' lo azzera (troncando la riga) e segnala continuazione.</w:t>
+        <w:t>Legge una riga fisica dal file dei parametri; se termina (spazi esclusi) con il carattere '+', continua a leggere e concatenare le righe successive (ignorando quelle che iniziano per '*', considerate commento) finché non trova una riga che non richiede continuazione. Segnala l'EOF restituendo una stringa vuota.</w:t>
       </w:r>
     </w:p>
     <w:p>
@@ -11973,7 +11995,7 @@
           </w:tcPr>
           <w:p>
             <w:r>
-              <w:t>str</w:t>
+              <w:t>buff</w:t>
             </w:r>
           </w:p>
         </w:tc>
@@ -11983,7 +12005,29 @@
           </w:tcPr>
           <w:p>
             <w:r>
-              <w:t>riga da esaminare (modificata in place se termina con '+')</w:t>
+              <w:t>buffer riallocabile in cui viene restituita la riga logica completa</w:t>
+            </w:r>
+          </w:p>
+        </w:tc>
+      </w:tr>
+      <w:tr>
+        <w:tc>
+          <w:tcPr>
+            <w:tcW w:type="dxa" w:w="1984"/>
+          </w:tcPr>
+          <w:p>
+            <w:r>
+              <w:t>parm</w:t>
+            </w:r>
+          </w:p>
+        </w:tc>
+        <w:tc>
+          <w:tcPr>
+            <w:tcW w:type="dxa" w:w="7087"/>
+          </w:tcPr>
+          <w:p>
+            <w:r>
+              <w:t>file handle del file dei parametri (DD:UTIPARM)</w:t>
             </w:r>
           </w:p>
         </w:tc>
@@ -11997,7 +12041,7 @@
         <w:t xml:space="preserve">Valore di ritorno: </w:t>
       </w:r>
       <w:r>
-        <w:t>int — 1 se richiesta continuazione, 0 altrimenti</w:t>
+        <w:t>char* — buff riallocato con la riga logica (stringa vuota a EOF)</w:t>
       </w:r>
     </w:p>
     <w:p>
@@ -12008,32 +12052,16 @@
         <w:t xml:space="preserve">Note: </w:t>
       </w:r>
       <w:r>
-        <w:t>Funzione locale (static) a getlrow.c.</w:t>
+        <w:t>Termina il programma (exit(8)) se viene richiesta una continuazione ma si incontra EOF prima di trovarla.</w:t>
       </w:r>
     </w:p>
     <w:p/>
-    <w:p>
-      <w:pPr>
-        <w:pStyle w:val="Heading2"/>
-      </w:pPr>
-      <w:r>
-        <w:t>findevt.c</w:t>
-      </w:r>
-    </w:p>
-    <w:p>
-      <w:r>
-        <w:rPr>
-          <w:i/>
-        </w:rPr>
-        <w:t>Ricerca di un evento nella linked list per nome o per codice.</w:t>
-      </w:r>
-    </w:p>
     <w:p>
       <w:pPr>
         <w:pStyle w:val="Heading3"/>
       </w:pPr>
       <w:r>
-        <w:t>findevt()</w:t>
+        <w:t>continua()</w:t>
       </w:r>
     </w:p>
     <w:p>
@@ -12043,7 +12071,7 @@
           <w:i/>
           <w:sz w:val="19"/>
         </w:rPr>
-        <w:t>st_sm80_evt *findevt(const char *name, st_sm80_evt *root_evt)</w:t>
+        <w:t>static int continua(char *str)</w:t>
       </w:r>
     </w:p>
     <w:p>
@@ -12054,7 +12082,7 @@
         <w:t xml:space="preserve">File: </w:t>
       </w:r>
       <w:r>
-        <w:t>findevt.c</w:t>
+        <w:t>getlrow.c</w:t>
       </w:r>
     </w:p>
     <w:p>
@@ -12065,7 +12093,7 @@
         <w:t xml:space="preserve">Scopo: </w:t>
       </w:r>
       <w:r>
-        <w:t>Scorre la linked list degli eventi cercando quello con nome corrispondente.</w:t>
+        <w:t>Verifica se la riga richiede continuazione: scandisce la stringa dalla fine ignorando gli spazi, e se trova '+' lo azzera (troncando la riga) e segnala continuazione.</w:t>
       </w:r>
     </w:p>
     <w:p>
@@ -12126,7 +12154,7 @@
           </w:tcPr>
           <w:p>
             <w:r>
-              <w:t>name</w:t>
+              <w:t>str</w:t>
             </w:r>
           </w:p>
         </w:tc>
@@ -12136,29 +12164,7 @@
           </w:tcPr>
           <w:p>
             <w:r>
-              <w:t>nome evento da cercare</w:t>
-            </w:r>
-          </w:p>
-        </w:tc>
-      </w:tr>
-      <w:tr>
-        <w:tc>
-          <w:tcPr>
-            <w:tcW w:type="dxa" w:w="1984"/>
-          </w:tcPr>
-          <w:p>
-            <w:r>
-              <w:t>root_evt</w:t>
-            </w:r>
-          </w:p>
-        </w:tc>
-        <w:tc>
-          <w:tcPr>
-            <w:tcW w:type="dxa" w:w="7087"/>
-          </w:tcPr>
-          <w:p>
-            <w:r>
-              <w:t>radice della linked list eventi</w:t>
+              <w:t>riga da esaminare (modificata in place se termina con '+')</w:t>
             </w:r>
           </w:p>
         </w:tc>
@@ -12172,7 +12178,7 @@
         <w:t xml:space="preserve">Valore di ritorno: </w:t>
       </w:r>
       <w:r>
-        <w:t>st_sm80_evt* — nodo trovato, o NULL</w:t>
+        <w:t>int — 1 se richiesta continuazione, 0 altrimenti</w:t>
       </w:r>
     </w:p>
     <w:p>
@@ -12183,16 +12189,32 @@
         <w:t xml:space="preserve">Note: </w:t>
       </w:r>
       <w:r>
-        <w:t>Usata da chkparm per validare i valori richiesti nel filtro EVENT.</w:t>
+        <w:t>Funzione locale (static) a getlrow.c.</w:t>
       </w:r>
     </w:p>
     <w:p/>
+    <w:p>
+      <w:pPr>
+        <w:pStyle w:val="Heading2"/>
+      </w:pPr>
+      <w:r>
+        <w:t>findevt.c</w:t>
+      </w:r>
+    </w:p>
+    <w:p>
+      <w:r>
+        <w:rPr>
+          <w:i/>
+        </w:rPr>
+        <w:t>Ricerca di un evento nella linked list per nome o per codice.</w:t>
+      </w:r>
+    </w:p>
     <w:p>
       <w:pPr>
         <w:pStyle w:val="Heading3"/>
       </w:pPr>
       <w:r>
-        <w:t>findevtn()</w:t>
+        <w:t>findevt()</w:t>
       </w:r>
     </w:p>
     <w:p>
@@ -12202,7 +12224,7 @@
           <w:i/>
           <w:sz w:val="19"/>
         </w:rPr>
-        <w:t>st_sm80_evt *findevtn(uint8_t num_evt, st_sm80_evt *root_evt)</w:t>
+        <w:t>st_sm80_evt *findevt(const char *name, st_sm80_evt *root_evt)</w:t>
       </w:r>
     </w:p>
     <w:p>
@@ -12224,7 +12246,7 @@
         <w:t xml:space="preserve">Scopo: </w:t>
       </w:r>
       <w:r>
-        <w:t>Scorre la linked list degli eventi cercando quello con codice numerico corrispondente.</w:t>
+        <w:t>Scorre la linked list degli eventi cercando quello con nome corrispondente.</w:t>
       </w:r>
     </w:p>
     <w:p>
@@ -12285,7 +12307,7 @@
           </w:tcPr>
           <w:p>
             <w:r>
-              <w:t>num_evt</w:t>
+              <w:t>name</w:t>
             </w:r>
           </w:p>
         </w:tc>
@@ -12295,7 +12317,7 @@
           </w:tcPr>
           <w:p>
             <w:r>
-              <w:t>codice evento da cercare (SMF80EVT del record)</w:t>
+              <w:t>nome evento da cercare</w:t>
             </w:r>
           </w:p>
         </w:tc>
@@ -12342,32 +12364,16 @@
         <w:t xml:space="preserve">Note: </w:t>
       </w:r>
       <w:r>
-        <w:t>Usata dai programmi principali per risolvere il nome/descrizione dell'evento di ogni record letto.</w:t>
+        <w:t>Usata da chkparm per validare i valori richiesti nel filtro EVENT.</w:t>
       </w:r>
     </w:p>
     <w:p/>
-    <w:p>
-      <w:pPr>
-        <w:pStyle w:val="Heading2"/>
-      </w:pPr>
-      <w:r>
-        <w:t>gettrow.c</w:t>
-      </w:r>
-    </w:p>
-    <w:p>
-      <w:r>
-        <w:rPr>
-          <w:i/>
-        </w:rPr>
-        <w:t>Estrazione, da una riga logica, di caratteristica, operatore e linked list dei filtri richiesti.</w:t>
-      </w:r>
-    </w:p>
     <w:p>
       <w:pPr>
         <w:pStyle w:val="Heading3"/>
       </w:pPr>
       <w:r>
-        <w:t>gettrow()</w:t>
+        <w:t>findevtn()</w:t>
       </w:r>
     </w:p>
     <w:p>
@@ -12377,7 +12383,7 @@
           <w:i/>
           <w:sz w:val="19"/>
         </w:rPr>
-        <w:t>int gettrow(char *buff, runparm *p_param)</w:t>
+        <w:t>st_sm80_evt *findevtn(uint8_t num_evt, st_sm80_evt *root_evt)</w:t>
       </w:r>
     </w:p>
     <w:p>
@@ -12388,7 +12394,7 @@
         <w:t xml:space="preserve">File: </w:t>
       </w:r>
       <w:r>
-        <w:t>gettrow.c</w:t>
+        <w:t>findevt.c</w:t>
       </w:r>
     </w:p>
     <w:p>
@@ -12399,7 +12405,7 @@
         <w:t xml:space="preserve">Scopo: </w:t>
       </w:r>
       <w:r>
-        <w:t>Tokenizza la riga logica (già ricostruita da getlrow), valida il primo token (caratteristica) e il secondo (operatore) contro le tabelle ammesse in smf80sup.h, imposta i flag delle sezioni da ricercare per quella caratteristica (p_param-&gt;smf80sec_fl), crea o recupera il nodo parametro corrispondente (consentendo l'accodamento di ulteriori filtri se l'operatore coincide con quello già impostato) e aggiunge un nodo filtro per ciascun valore rimanente nella riga, verificandone la lunghezza massima ammessa.</w:t>
+        <w:t>Scorre la linked list degli eventi cercando quello con codice numerico corrispondente.</w:t>
       </w:r>
     </w:p>
     <w:p>
@@ -12460,7 +12466,7 @@
           </w:tcPr>
           <w:p>
             <w:r>
-              <w:t>buff</w:t>
+              <w:t>num_evt</w:t>
             </w:r>
           </w:p>
         </w:tc>
@@ -12470,7 +12476,7 @@
           </w:tcPr>
           <w:p>
             <w:r>
-              <w:t>riga logica dei criteri già concatenata</w:t>
+              <w:t>codice evento da cercare (SMF80EVT del record)</w:t>
             </w:r>
           </w:p>
         </w:tc>
@@ -12482,7 +12488,7 @@
           </w:tcPr>
           <w:p>
             <w:r>
-              <w:t>p_param</w:t>
+              <w:t>root_evt</w:t>
             </w:r>
           </w:p>
         </w:tc>
@@ -12492,7 +12498,7 @@
           </w:tcPr>
           <w:p>
             <w:r>
-              <w:t>struttura runparm in cui accumulare i parametri/filtri</w:t>
+              <w:t>radice della linked list eventi</w:t>
             </w:r>
           </w:p>
         </w:tc>
@@ -12506,7 +12512,7 @@
         <w:t xml:space="preserve">Valore di ritorno: </w:t>
       </w:r>
       <w:r>
-        <w:t>int — 0 ok, 4 riga vuota o commento (ignorata), 8 errore grave (caratteristica/operatore invalidi, elemento troppo lungo, operatore ABR su filtro numerico, o operatore incoerente con richiesta precedente)</w:t>
+        <w:t>st_sm80_evt* — nodo trovato, o NULL</w:t>
       </w:r>
     </w:p>
     <w:p>
@@ -12517,16 +12523,32 @@
         <w:t xml:space="preserve">Note: </w:t>
       </w:r>
       <w:r>
-        <w:t>Le righe vuote o di commento non causano l'arresto: il chiamante (getParm) tratta rc=4 come 0.</w:t>
+        <w:t>Usata dai programmi principali per risolvere il nome/descrizione dell'evento di ogni record letto.</w:t>
       </w:r>
     </w:p>
     <w:p/>
+    <w:p>
+      <w:pPr>
+        <w:pStyle w:val="Heading2"/>
+      </w:pPr>
+      <w:r>
+        <w:t>gettrow.c</w:t>
+      </w:r>
+    </w:p>
+    <w:p>
+      <w:r>
+        <w:rPr>
+          <w:i/>
+        </w:rPr>
+        <w:t>Estrazione, da una riga logica, di caratteristica, operatore e linked list dei filtri richiesti.</w:t>
+      </w:r>
+    </w:p>
     <w:p>
       <w:pPr>
         <w:pStyle w:val="Heading3"/>
       </w:pPr>
       <w:r>
-        <w:t>put_token()</w:t>
+        <w:t>gettrow()</w:t>
       </w:r>
     </w:p>
     <w:p>
@@ -12536,7 +12558,7 @@
           <w:i/>
           <w:sz w:val="19"/>
         </w:rPr>
-        <w:t>static void put_token(char *data, uint32_t num, char *desc, list_parameter *pf)</w:t>
+        <w:t>int gettrow(char *buff, runparm *p_param)</w:t>
       </w:r>
     </w:p>
     <w:p>
@@ -12558,7 +12580,7 @@
         <w:t xml:space="preserve">Scopo: </w:t>
       </w:r>
       <w:r>
-        <w:t>Crea un nodo filtro (tramite crfilter) e lo accoda alla lista dei filtri del parametro pf.</w:t>
+        <w:t>Tokenizza la riga logica (già ricostruita da getlrow), valida il primo token (caratteristica) e il secondo (operatore) contro le tabelle ammesse in smf80sup.h, imposta i flag delle sezioni da ricercare per quella caratteristica (p_param-&gt;smf80sec_fl), crea o recupera il nodo parametro corrispondente (consentendo l'accodamento di ulteriori filtri se l'operatore coincide con quello già impostato) e aggiunge un nodo filtro per ciascun valore rimanente nella riga, verificandone la lunghezza massima ammessa.</w:t>
       </w:r>
     </w:p>
     <w:p>
@@ -12619,7 +12641,7 @@
           </w:tcPr>
           <w:p>
             <w:r>
-              <w:t>data</w:t>
+              <w:t>buff</w:t>
             </w:r>
           </w:p>
         </w:tc>
@@ -12629,7 +12651,7 @@
           </w:tcPr>
           <w:p>
             <w:r>
-              <w:t>valore testuale del filtro</w:t>
+              <w:t>riga logica dei criteri già concatenata</w:t>
             </w:r>
           </w:p>
         </w:tc>
@@ -12641,7 +12663,7 @@
           </w:tcPr>
           <w:p>
             <w:r>
-              <w:t>num</w:t>
+              <w:t>p_param</w:t>
             </w:r>
           </w:p>
         </w:tc>
@@ -12651,51 +12673,7 @@
           </w:tcPr>
           <w:p>
             <w:r>
-              <w:t>valore numerico (0 in questa fase)</w:t>
-            </w:r>
-          </w:p>
-        </w:tc>
-      </w:tr>
-      <w:tr>
-        <w:tc>
-          <w:tcPr>
-            <w:tcW w:type="dxa" w:w="1984"/>
-          </w:tcPr>
-          <w:p>
-            <w:r>
-              <w:t>desc</w:t>
-            </w:r>
-          </w:p>
-        </w:tc>
-        <w:tc>
-          <w:tcPr>
-            <w:tcW w:type="dxa" w:w="7087"/>
-          </w:tcPr>
-          <w:p>
-            <w:r>
-              <w:t>descrizione (NULL in questa fase)</w:t>
-            </w:r>
-          </w:p>
-        </w:tc>
-      </w:tr>
-      <w:tr>
-        <w:tc>
-          <w:tcPr>
-            <w:tcW w:type="dxa" w:w="1984"/>
-          </w:tcPr>
-          <w:p>
-            <w:r>
-              <w:t>pf</w:t>
-            </w:r>
-          </w:p>
-        </w:tc>
-        <w:tc>
-          <w:tcPr>
-            <w:tcW w:type="dxa" w:w="7087"/>
-          </w:tcPr>
-          <w:p>
-            <w:r>
-              <w:t>nodo parametro a cui accodare il filtro</w:t>
+              <w:t>struttura runparm in cui accumulare i parametri/filtri</w:t>
             </w:r>
           </w:p>
         </w:tc>
@@ -12709,7 +12687,7 @@
         <w:t xml:space="preserve">Valore di ritorno: </w:t>
       </w:r>
       <w:r>
-        <w:t>void</w:t>
+        <w:t>int — 0 ok, 4 riga vuota o commento (ignorata), 8 errore grave (caratteristica/operatore invalidi, elemento troppo lungo, operatore ABR su filtro numerico, o operatore incoerente con richiesta precedente)</w:t>
       </w:r>
     </w:p>
     <w:p>
@@ -12720,32 +12698,16 @@
         <w:t xml:space="preserve">Note: </w:t>
       </w:r>
       <w:r>
-        <w:t>Funzione locale (static) a gettrow.c.</w:t>
+        <w:t>Le righe vuote o di commento non causano l'arresto: il chiamante (getParm) tratta rc=4 come 0.</w:t>
       </w:r>
     </w:p>
     <w:p/>
-    <w:p>
-      <w:pPr>
-        <w:pStyle w:val="Heading2"/>
-      </w:pPr>
-      <w:r>
-        <w:t>chkparm.c</w:t>
-      </w:r>
-    </w:p>
-    <w:p>
-      <w:r>
-        <w:rPr>
-          <w:i/>
-        </w:rPr>
-        <w:t>Controlli di validità logica sull'insieme dei parametri e filtri caricati.</w:t>
-      </w:r>
-    </w:p>
     <w:p>
       <w:pPr>
         <w:pStyle w:val="Heading3"/>
       </w:pPr>
       <w:r>
-        <w:t>chkparm()</w:t>
+        <w:t>put_token()</w:t>
       </w:r>
     </w:p>
     <w:p>
@@ -12755,7 +12717,7 @@
           <w:i/>
           <w:sz w:val="19"/>
         </w:rPr>
-        <w:t>int chkparm(runparm *p_param, st_sm80_cls *root_cls, st_sm80_evt *root_evt, char *fileCNTL)</w:t>
+        <w:t>static void put_token(char *data, uint32_t num, char *desc, list_parameter *pf)</w:t>
       </w:r>
     </w:p>
     <w:p>
@@ -12766,7 +12728,7 @@
         <w:t xml:space="preserve">File: </w:t>
       </w:r>
       <w:r>
-        <w:t>chkparm.c</w:t>
+        <w:t>gettrow.c</w:t>
       </w:r>
     </w:p>
     <w:p>
@@ -12777,7 +12739,7 @@
         <w:t xml:space="preserve">Scopo: </w:t>
       </w:r>
       <w:r>
-        <w:t>Esegue le verifiche incrociate tra le caratteristiche richieste, non verificabili in gettrow perché richiedono il quadro completo dei parametri: risoluzione e validazione dei valori EVENT contro la tabella eventi; RESULT richiede un solo EVENT abbinato e ne carica gli Event Qualifier validi (getEvq); DESCR/REASN/AUTH validati contro le tabelle costanti in smf80sup.h; CLASS validata contro le classi RACF caricate (rifiuta le grouping class, suggerendo la member class); USRJES ammessa solo abbinata a CLASS = JESSPOOL con operatore '='.</w:t>
+        <w:t>Crea un nodo filtro (tramite crfilter) e lo accoda alla lista dei filtri del parametro pf.</w:t>
       </w:r>
     </w:p>
     <w:p>
@@ -12838,7 +12800,7 @@
           </w:tcPr>
           <w:p>
             <w:r>
-              <w:t>p_param</w:t>
+              <w:t>data</w:t>
             </w:r>
           </w:p>
         </w:tc>
@@ -12848,7 +12810,7 @@
           </w:tcPr>
           <w:p>
             <w:r>
-              <w:t>struttura runparm con i parametri/filtri accumulati da gettrow</w:t>
+              <w:t>valore testuale del filtro</w:t>
             </w:r>
           </w:p>
         </w:tc>
@@ -12860,7 +12822,7 @@
           </w:tcPr>
           <w:p>
             <w:r>
-              <w:t>root_cls</w:t>
+              <w:t>num</w:t>
             </w:r>
           </w:p>
         </w:tc>
@@ -12870,7 +12832,7 @@
           </w:tcPr>
           <w:p>
             <w:r>
-              <w:t>linked list delle classi RACF (da get_CDT)</w:t>
+              <w:t>valore numerico (0 in questa fase)</w:t>
             </w:r>
           </w:p>
         </w:tc>
@@ -12882,7 +12844,7 @@
           </w:tcPr>
           <w:p>
             <w:r>
-              <w:t>root_evt</w:t>
+              <w:t>desc</w:t>
             </w:r>
           </w:p>
         </w:tc>
@@ -12892,7 +12854,7 @@
           </w:tcPr>
           <w:p>
             <w:r>
-              <w:t>linked list degli eventi (da getEvt)</w:t>
+              <w:t>descrizione (NULL in questa fase)</w:t>
             </w:r>
           </w:p>
         </w:tc>
@@ -12904,7 +12866,7 @@
           </w:tcPr>
           <w:p>
             <w:r>
-              <w:t>fileCNTL</w:t>
+              <w:t>pf</w:t>
             </w:r>
           </w:p>
         </w:tc>
@@ -12914,7 +12876,7 @@
           </w:tcPr>
           <w:p>
             <w:r>
-              <w:t>DD/path del PDS di controllo, usato per caricare gli Event Qualifier</w:t>
+              <w:t>nodo parametro a cui accodare il filtro</w:t>
             </w:r>
           </w:p>
         </w:tc>
@@ -12928,7 +12890,7 @@
         <w:t xml:space="preserve">Valore di ritorno: </w:t>
       </w:r>
       <w:r>
-        <w:t>int — max return code tra 0 (ok) e 8 (uno o più errori di validazione)</w:t>
+        <w:t>void</w:t>
       </w:r>
     </w:p>
     <w:p>
@@ -12939,7 +12901,7 @@
         <w:t xml:space="preserve">Note: </w:t>
       </w:r>
       <w:r>
-        <w:t>getParm considera l'elaborazione non proseguibile se il return code è diverso da 0.</w:t>
+        <w:t>Funzione locale (static) a gettrow.c.</w:t>
       </w:r>
     </w:p>
     <w:p/>
@@ -12948,7 +12910,7 @@
         <w:pStyle w:val="Heading2"/>
       </w:pPr>
       <w:r>
-        <w:t>getParm.c</w:t>
+        <w:t>chkparm.c</w:t>
       </w:r>
     </w:p>
     <w:p>
@@ -12956,7 +12918,7 @@
         <w:rPr>
           <w:i/>
         </w:rPr>
-        <w:t>Lettura e validazione completa del file dei parametri/criteri di estrazione.</w:t>
+        <w:t>Controlli di validità logica sull'insieme dei parametri e filtri caricati.</w:t>
       </w:r>
     </w:p>
     <w:p>
@@ -12964,7 +12926,7 @@
         <w:pStyle w:val="Heading3"/>
       </w:pPr>
       <w:r>
-        <w:t>getParm()</w:t>
+        <w:t>chkparm()</w:t>
       </w:r>
     </w:p>
     <w:p>
@@ -12974,7 +12936,7 @@
           <w:i/>
           <w:sz w:val="19"/>
         </w:rPr>
-        <w:t>runparm *getParm(char *filePARM, char *fileCNTL, st_sm80_evt *root_evt)</w:t>
+        <w:t>int chkparm(runparm *p_param, st_sm80_cls *root_cls, st_sm80_evt *root_evt, char *fileCNTL)</w:t>
       </w:r>
     </w:p>
     <w:p>
@@ -12985,7 +12947,7 @@
         <w:t xml:space="preserve">File: </w:t>
       </w:r>
       <w:r>
-        <w:t>getParm.c</w:t>
+        <w:t>chkparm.c</w:t>
       </w:r>
     </w:p>
     <w:p>
@@ -12996,7 +12958,7 @@
         <w:t xml:space="preserve">Scopo: </w:t>
       </w:r>
       <w:r>
-        <w:t>Funzione di alto livello che orchestra il caricamento dei criteri: apre DD:UTIPARM, carica le classi RACF leggendo la CDT (get_CDT), legge riga per riga con getlrow (gestendo concatenazioni), per ciascuna riga richiama gettrow per popolare la struttura runparm, quindi richiama chkparm per la validazione incrociata finale. Se il return code cumulativo è diverso da 0 termina il programma (exit). Se tutto è corretto, stampa il resoconto dei filtri effettivamente richiesti (stampa_filtri) e restituisce la struttura pronta per l'uso.</w:t>
+        <w:t>Esegue le verifiche incrociate tra le caratteristiche richieste, non verificabili in gettrow perché richiedono il quadro completo dei parametri: risoluzione e validazione dei valori EVENT contro la tabella eventi; RESULT richiede un solo EVENT abbinato e ne carica gli Event Qualifier validi (getEvq); DESCR/REASN/AUTH validati contro le tabelle costanti in smf80sup.h; CLASS validata contro le classi RACF caricate (rifiuta le grouping class, suggerendo la member class); USRJES ammessa solo abbinata a CLASS = JESSPOOL con operatore '='.</w:t>
       </w:r>
     </w:p>
     <w:p>
@@ -13057,7 +13019,7 @@
           </w:tcPr>
           <w:p>
             <w:r>
-              <w:t>filePARM</w:t>
+              <w:t>p_param</w:t>
             </w:r>
           </w:p>
         </w:tc>
@@ -13067,7 +13029,7 @@
           </w:tcPr>
           <w:p>
             <w:r>
-              <w:t>DD/path del file sequenziale con i criteri (DD:UTIPARM)</w:t>
+              <w:t>struttura runparm con i parametri/filtri accumulati da gettrow</w:t>
             </w:r>
           </w:p>
         </w:tc>
@@ -13079,7 +13041,7 @@
           </w:tcPr>
           <w:p>
             <w:r>
-              <w:t>fileCNTL</w:t>
+              <w:t>root_cls</w:t>
             </w:r>
           </w:p>
         </w:tc>
@@ -13089,7 +13051,7 @@
           </w:tcPr>
           <w:p>
             <w:r>
-              <w:t>DD/path del PDS di controllo (DD:UTICNTL)</w:t>
+              <w:t>linked list delle classi RACF (da get_CDT)</w:t>
             </w:r>
           </w:p>
         </w:tc>
@@ -13111,7 +13073,29 @@
           </w:tcPr>
           <w:p>
             <w:r>
-              <w:t>linked list degli eventi già caricata dal chiamante</w:t>
+              <w:t>linked list degli eventi (da getEvt)</w:t>
+            </w:r>
+          </w:p>
+        </w:tc>
+      </w:tr>
+      <w:tr>
+        <w:tc>
+          <w:tcPr>
+            <w:tcW w:type="dxa" w:w="1984"/>
+          </w:tcPr>
+          <w:p>
+            <w:r>
+              <w:t>fileCNTL</w:t>
+            </w:r>
+          </w:p>
+        </w:tc>
+        <w:tc>
+          <w:tcPr>
+            <w:tcW w:type="dxa" w:w="7087"/>
+          </w:tcPr>
+          <w:p>
+            <w:r>
+              <w:t>DD/path del PDS di controllo, usato per caricare gli Event Qualifier</w:t>
             </w:r>
           </w:p>
         </w:tc>
@@ -13125,7 +13109,7 @@
         <w:t xml:space="preserve">Valore di ritorno: </w:t>
       </w:r>
       <w:r>
-        <w:t>runparm* — struttura con i parametri e i flag delle sezioni da cercare, pronta per il filtro</w:t>
+        <w:t>int — max return code tra 0 (ok) e 8 (uno o più errori di validazione)</w:t>
       </w:r>
     </w:p>
     <w:p>
@@ -13136,16 +13120,32 @@
         <w:t xml:space="preserve">Note: </w:t>
       </w:r>
       <w:r>
-        <w:t>Punto di ingresso unico usato sia da smf80dmp.c sia da smf80ext.c.</w:t>
+        <w:t>getParm considera l'elaborazione non proseguibile se il return code è diverso da 0.</w:t>
       </w:r>
     </w:p>
     <w:p/>
+    <w:p>
+      <w:pPr>
+        <w:pStyle w:val="Heading2"/>
+      </w:pPr>
+      <w:r>
+        <w:t>getParm.c</w:t>
+      </w:r>
+    </w:p>
+    <w:p>
+      <w:r>
+        <w:rPr>
+          <w:i/>
+        </w:rPr>
+        <w:t>Lettura e validazione completa del file dei parametri/criteri di estrazione.</w:t>
+      </w:r>
+    </w:p>
     <w:p>
       <w:pPr>
         <w:pStyle w:val="Heading3"/>
       </w:pPr>
       <w:r>
-        <w:t>stampa_filtri()</w:t>
+        <w:t>getParm()</w:t>
       </w:r>
     </w:p>
     <w:p>
@@ -13155,7 +13155,7 @@
           <w:i/>
           <w:sz w:val="19"/>
         </w:rPr>
-        <w:t>void stampa_filtri(list_parameter *p_par, int num_car)</w:t>
+        <w:t>runparm *getParm(char *filePARM, char *fileCNTL, st_sm80_evt *root_evt)</w:t>
       </w:r>
     </w:p>
     <w:p>
@@ -13177,7 +13177,7 @@
         <w:t xml:space="preserve">Scopo: </w:t>
       </w:r>
       <w:r>
-        <w:t>Stampa un resoconto leggibile dei filtri caricati per una caratteristica: nome, operatore, e per ciascun valore il codice interno (se numerico) e la descrizione; per il filtro CLASS con operatore ABR, elenca anche tutte le classi RACF che iniziano con l'abbreviazione richiesta (escludendo le grouping class).</w:t>
+        <w:t>Funzione di alto livello che orchestra il caricamento dei criteri: apre DD:UTIPARM, carica le classi RACF leggendo la CDT (get_CDT), legge riga per riga con getlrow (gestendo concatenazioni), per ciascuna riga richiama gettrow per popolare la struttura runparm, quindi richiama chkparm per la validazione incrociata finale. Se il return code cumulativo è diverso da 0 termina il programma (exit). Se tutto è corretto, stampa il resoconto dei filtri effettivamente richiesti (stampa_filtri) e restituisce la struttura pronta per l'uso.</w:t>
       </w:r>
     </w:p>
     <w:p>
@@ -13238,7 +13238,7 @@
           </w:tcPr>
           <w:p>
             <w:r>
-              <w:t>p_par</w:t>
+              <w:t>filePARM</w:t>
             </w:r>
           </w:p>
         </w:tc>
@@ -13248,7 +13248,7 @@
           </w:tcPr>
           <w:p>
             <w:r>
-              <w:t>nodo parametro (caratteristica) da stampare</w:t>
+              <w:t>DD/path del file sequenziale con i criteri (DD:UTIPARM)</w:t>
             </w:r>
           </w:p>
         </w:tc>
@@ -13260,7 +13260,7 @@
           </w:tcPr>
           <w:p>
             <w:r>
-              <w:t>num_car</w:t>
+              <w:t>fileCNTL</w:t>
             </w:r>
           </w:p>
         </w:tc>
@@ -13270,7 +13270,29 @@
           </w:tcPr>
           <w:p>
             <w:r>
-              <w:t>posizione della caratteristica nell'array l_parm, per accedere alle tabelle correlate</w:t>
+              <w:t>DD/path del PDS di controllo (DD:UTICNTL)</w:t>
+            </w:r>
+          </w:p>
+        </w:tc>
+      </w:tr>
+      <w:tr>
+        <w:tc>
+          <w:tcPr>
+            <w:tcW w:type="dxa" w:w="1984"/>
+          </w:tcPr>
+          <w:p>
+            <w:r>
+              <w:t>root_evt</w:t>
+            </w:r>
+          </w:p>
+        </w:tc>
+        <w:tc>
+          <w:tcPr>
+            <w:tcW w:type="dxa" w:w="7087"/>
+          </w:tcPr>
+          <w:p>
+            <w:r>
+              <w:t>linked list degli eventi già caricata dal chiamante</w:t>
             </w:r>
           </w:p>
         </w:tc>
@@ -13284,7 +13306,7 @@
         <w:t xml:space="preserve">Valore di ritorno: </w:t>
       </w:r>
       <w:r>
-        <w:t>void</w:t>
+        <w:t>runparm* — struttura con i parametri e i flag delle sezioni da cercare, pronta per il filtro</w:t>
       </w:r>
     </w:p>
     <w:p>
@@ -13295,88 +13317,56 @@
         <w:t xml:space="preserve">Note: </w:t>
       </w:r>
       <w:r>
-        <w:t>Funzione locale (non extern) a getParm.c.</w:t>
+        <w:t>Punto di ingresso unico usato sia da smf80dmp.c sia da smf80ext.c.</w:t>
       </w:r>
     </w:p>
     <w:p/>
-    <w:p>
-      <w:pPr>
-        <w:pStyle w:val="Heading2"/>
-      </w:pPr>
-      <w:r>
-        <w:t>box.prolog</w:t>
-      </w:r>
-    </w:p>
-    <w:p>
-      <w:r>
-        <w:rPr>
-          <w:i/>
-        </w:rPr>
-        <w:t>Modello dell'intestazione standard (ex box.c): solo commento di testata e include, nessuna funzione implementata.</w:t>
-      </w:r>
-    </w:p>
-    <w:p>
-      <w:r>
-        <w:t>Nessuna funzione implementata in questo file.</w:t>
-      </w:r>
-    </w:p>
-    <w:p>
-      <w:r>
-        <w:br w:type="page"/>
-      </w:r>
-    </w:p>
-    <w:p>
-      <w:pPr>
-        <w:pStyle w:val="Heading1"/>
-      </w:pPr>
-      <w:r>
-        <w:t>4. Istruzioni per l'uso</w:t>
-      </w:r>
-    </w:p>
-    <w:p>
-      <w:pPr>
-        <w:pStyle w:val="Heading2"/>
-      </w:pPr>
-      <w:r>
-        <w:t>4.1 Compilazione</w:t>
-      </w:r>
-    </w:p>
-    <w:p>
-      <w:r>
-        <w:t>La compilazione è pensata per l'ambiente z/OS UNIX System Services, con il compilatore xlc e il tool make. I makefile di riferimento sono smf80ext.mk e smf80dmp.mk; i listati di compilazione sono scritti nella sottodirectory ./lst.</w:t>
-      </w:r>
-    </w:p>
     <w:p>
       <w:pPr>
         <w:pStyle w:val="Heading3"/>
       </w:pPr>
       <w:r>
-        <w:t>smf80ext.mk</w:t>
-      </w:r>
-    </w:p>
-    <w:p>
-      <w:r>
-        <w:t>Ogni sorgente C viene compilato in un oggetto (.o), compreso il programma principale; le routine Metal C seguono la catena .c → .s (xlc -S -qmetal), concatenazione con metalc_prolog.mac e assemblaggio con as -mgoff. Gli oggetti sono poi linkati in /u/&lt;UserId&gt;/bin; il modulo viene copiato nel PDSE &lt;MyPrefix&gt;.LLIB e i listati di smf80ext e smf81dec in &lt;MyPrefix&gt;.C.DBG per Fault Analyzer. I messaggi del binder sono scritti in ./lst/smf80ext.lnk. L'opzione -qmakedep genera per ogni sorgente un file .u con le dipendenze dagli header, incluso dal makefile: modificando un header vengono ricompilati solo i sorgenti che lo usano.</w:t>
+        <w:t>stampa_filtri()</w:t>
       </w:r>
     </w:p>
     <w:p>
       <w:r>
         <w:rPr>
           <w:rFonts w:ascii="Consolas" w:hAnsi="Consolas"/>
-          <w:sz w:val="20"/>
-        </w:rPr>
-        <w:t>make -f smf80ext.mk                      solo i sorgenti modificati</w:t>
-        <w:br/>
-        <w:t>make -u -f smf80ext.mk                   ricompilazione completa</w:t>
-        <w:br/>
-        <w:t>make -p -f smf80ext.mk &gt;makeout.txt      con dump di macro e regole</w:t>
-        <w:br/>
-        <w:t>make -f smf80ext.mk clean                pulizia di oggetti, .s e .u</w:t>
-      </w:r>
-    </w:p>
-    <w:p>
-      <w:r>
-        <w:t>Variabili impostabili da riga di comando:</w:t>
+          <w:i/>
+          <w:sz w:val="19"/>
+        </w:rPr>
+        <w:t>void stampa_filtri(list_parameter *p_par, int num_car)</w:t>
+      </w:r>
+    </w:p>
+    <w:p>
+      <w:r>
+        <w:rPr>
+          <w:b/>
+        </w:rPr>
+        <w:t xml:space="preserve">File: </w:t>
+      </w:r>
+      <w:r>
+        <w:t>getParm.c</w:t>
+      </w:r>
+    </w:p>
+    <w:p>
+      <w:r>
+        <w:rPr>
+          <w:b/>
+        </w:rPr>
+        <w:t xml:space="preserve">Scopo: </w:t>
+      </w:r>
+      <w:r>
+        <w:t>Stampa un resoconto leggibile dei filtri caricati per una caratteristica: nome, operatore, e per ciascun valore il codice interno (se numerico) e la descrizione; per il filtro CLASS con operatore ABR, elenca anche tutte le classi RACF che iniziano con l'abbreviazione richiesta (escludendo le grouping class).</w:t>
+      </w:r>
+    </w:p>
+    <w:p>
+      <w:r>
+        <w:rPr>
+          <w:b/>
+        </w:rPr>
+        <w:t>Parametri:</w:t>
       </w:r>
     </w:p>
     <w:tbl>
@@ -13402,7 +13392,7 @@
                 <w:b/>
                 <w:color w:val="FFFFFF"/>
               </w:rPr>
-              <w:t>Variabile</w:t>
+              <w:t>Parametro</w:t>
             </w:r>
           </w:p>
         </w:tc>
@@ -13417,7 +13407,7 @@
                 <w:b/>
                 <w:color w:val="FFFFFF"/>
               </w:rPr>
-              <w:t>Effetto</w:t>
+              <w:t>Descrizione</w:t>
             </w:r>
           </w:p>
         </w:tc>
@@ -13429,7 +13419,7 @@
           </w:tcPr>
           <w:p>
             <w:r>
-              <w:t>OPT</w:t>
+              <w:t>p_par</w:t>
             </w:r>
           </w:p>
         </w:tc>
@@ -13439,7 +13429,7 @@
           </w:tcPr>
           <w:p>
             <w:r>
-              <w:t>default -O (OPTIMIZE(2)).</w:t>
+              <w:t>nodo parametro (caratteristica) da stampare</w:t>
             </w:r>
           </w:p>
         </w:tc>
@@ -13451,7 +13441,7 @@
           </w:tcPr>
           <w:p>
             <w:r>
-              <w:t>DBG</w:t>
+              <w:t>num_car</w:t>
             </w:r>
           </w:p>
         </w:tc>
@@ -13461,29 +13451,7 @@
           </w:tcPr>
           <w:p>
             <w:r>
-              <w:t>vuota di default; DBG=-g genera il file .dbg per il debugger e disattiva l'ottimizzazione (xlc forza NOOPTIMIZE con -g, indipendentemente dall'ordine delle opzioni).</w:t>
-            </w:r>
-          </w:p>
-        </w:tc>
-      </w:tr>
-      <w:tr>
-        <w:tc>
-          <w:tcPr>
-            <w:tcW w:type="dxa" w:w="1984"/>
-          </w:tcPr>
-          <w:p>
-            <w:r>
-              <w:t>AGGR</w:t>
-            </w:r>
-          </w:p>
-        </w:tc>
-        <w:tc>
-          <w:tcPr>
-            <w:tcW w:type="dxa" w:w="7087"/>
-          </w:tcPr>
-          <w:p>
-            <w:r>
-              <w:t>vuota di default; AGGR=-Wc,AGGREGATE aggiunge ai listati la mappa di struct e union con gli offset dei campi. Per un solo programma si può usare #pragma options(aggregate).</w:t>
+              <w:t>posizione della caratteristica nell'array l_parm, per accedere alle tabelle correlate</w:t>
             </w:r>
           </w:p>
         </w:tc>
@@ -13491,12 +13459,105 @@
     </w:tbl>
     <w:p>
       <w:r>
-        <w:t>make non rileva il cambio di opzioni: quando si attiva o disattiva DBG o AGGR occorre usare -u, ad esempio make -u -f smf80ext.mk DBG=-g. Le routine Metal C sono volutamente compilate senza ottimizzazione: sono piccole, contengono HLASM inline e sono richiamate poche volte.</w:t>
-      </w:r>
-    </w:p>
-    <w:p>
-      <w:r>
-        <w:t>Effetto dell'ottimizzazione, misurato su un'elaborazione massiva di 1.374.748.727 record SMF (570.536 estratti, stesso output nei due casi):</w:t>
+        <w:rPr>
+          <w:b/>
+        </w:rPr>
+        <w:t xml:space="preserve">Valore di ritorno: </w:t>
+      </w:r>
+      <w:r>
+        <w:t>void</w:t>
+      </w:r>
+    </w:p>
+    <w:p>
+      <w:r>
+        <w:rPr>
+          <w:b/>
+        </w:rPr>
+        <w:t xml:space="preserve">Note: </w:t>
+      </w:r>
+      <w:r>
+        <w:t>Funzione locale (non extern) a getParm.c.</w:t>
+      </w:r>
+    </w:p>
+    <w:p/>
+    <w:p>
+      <w:pPr>
+        <w:pStyle w:val="Heading2"/>
+      </w:pPr>
+      <w:r>
+        <w:t>box.prolog</w:t>
+      </w:r>
+    </w:p>
+    <w:p>
+      <w:r>
+        <w:rPr>
+          <w:i/>
+        </w:rPr>
+        <w:t>Modello dell'intestazione standard (ex box.c): solo commento di testata e include, nessuna funzione implementata.</w:t>
+      </w:r>
+    </w:p>
+    <w:p>
+      <w:r>
+        <w:t>Nessuna funzione implementata in questo file.</w:t>
+      </w:r>
+    </w:p>
+    <w:p>
+      <w:r>
+        <w:br w:type="page"/>
+      </w:r>
+    </w:p>
+    <w:p>
+      <w:pPr>
+        <w:pStyle w:val="Heading1"/>
+      </w:pPr>
+      <w:r>
+        <w:t>4. Istruzioni per l'uso</w:t>
+      </w:r>
+    </w:p>
+    <w:p>
+      <w:pPr>
+        <w:pStyle w:val="Heading2"/>
+      </w:pPr>
+      <w:r>
+        <w:t>4.1 Compilazione</w:t>
+      </w:r>
+    </w:p>
+    <w:p>
+      <w:r>
+        <w:t>La compilazione è pensata per l'ambiente z/OS UNIX System Services, con il compilatore xlc e il tool make. I makefile di riferimento sono smf80ext.mk e smf80dmp.mk; i listati di compilazione sono scritti nella sottodirectory ./lst.</w:t>
+      </w:r>
+    </w:p>
+    <w:p>
+      <w:pPr>
+        <w:pStyle w:val="Heading3"/>
+      </w:pPr>
+      <w:r>
+        <w:t>smf80ext.mk</w:t>
+      </w:r>
+    </w:p>
+    <w:p>
+      <w:r>
+        <w:t>Ogni sorgente C viene compilato in un oggetto (.o), compreso il programma principale; le routine Metal C seguono la catena .c → .s (xlc -S -qmetal), concatenazione con metalc_prolog.mac e assemblaggio con as -mgoff. Gli oggetti sono poi linkati in /u/&lt;UserId&gt;/bin; il modulo viene copiato nel PDSE &lt;MyPrefix&gt;.LLIB e i listati di smf80ext e smf81dec in &lt;MyPrefix&gt;.C.DBG per Fault Analyzer. I messaggi del binder sono scritti in ./lst/smf80ext.lnk. L'opzione -qmakedep genera per ogni sorgente un file .u con le dipendenze dagli header, incluso dal makefile: modificando un header vengono ricompilati solo i sorgenti che lo usano.</w:t>
+      </w:r>
+    </w:p>
+    <w:p>
+      <w:r>
+        <w:rPr>
+          <w:rFonts w:ascii="Consolas" w:hAnsi="Consolas"/>
+          <w:sz w:val="20"/>
+        </w:rPr>
+        <w:t>make -f smf80ext.mk                      solo i sorgenti modificati</w:t>
+        <w:br/>
+        <w:t>make -u -f smf80ext.mk                   ricompilazione completa</w:t>
+        <w:br/>
+        <w:t>make -p -f smf80ext.mk &gt;makeout.txt      con dump di macro e regole</w:t>
+        <w:br/>
+        <w:t>make -f smf80ext.mk clean                pulizia di oggetti, .s e .u</w:t>
+      </w:r>
+    </w:p>
+    <w:p>
+      <w:r>
+        <w:t>Variabili impostabili da riga di comando:</w:t>
       </w:r>
     </w:p>
     <w:tbl>
@@ -13522,6 +13583,126 @@
                 <w:b/>
                 <w:color w:val="FFFFFF"/>
               </w:rPr>
+              <w:t>Variabile</w:t>
+            </w:r>
+          </w:p>
+        </w:tc>
+        <w:tc>
+          <w:tcPr>
+            <w:tcW w:type="dxa" w:w="7087"/>
+            <w:shd w:val="clear" w:color="auto" w:fill="1F3A5F"/>
+          </w:tcPr>
+          <w:p>
+            <w:r>
+              <w:rPr>
+                <w:b/>
+                <w:color w:val="FFFFFF"/>
+              </w:rPr>
+              <w:t>Effetto</w:t>
+            </w:r>
+          </w:p>
+        </w:tc>
+      </w:tr>
+      <w:tr>
+        <w:tc>
+          <w:tcPr>
+            <w:tcW w:type="dxa" w:w="1984"/>
+          </w:tcPr>
+          <w:p>
+            <w:r>
+              <w:t>OPT</w:t>
+            </w:r>
+          </w:p>
+        </w:tc>
+        <w:tc>
+          <w:tcPr>
+            <w:tcW w:type="dxa" w:w="7087"/>
+          </w:tcPr>
+          <w:p>
+            <w:r>
+              <w:t>default -O (OPTIMIZE(2)).</w:t>
+            </w:r>
+          </w:p>
+        </w:tc>
+      </w:tr>
+      <w:tr>
+        <w:tc>
+          <w:tcPr>
+            <w:tcW w:type="dxa" w:w="1984"/>
+          </w:tcPr>
+          <w:p>
+            <w:r>
+              <w:t>DBG</w:t>
+            </w:r>
+          </w:p>
+        </w:tc>
+        <w:tc>
+          <w:tcPr>
+            <w:tcW w:type="dxa" w:w="7087"/>
+          </w:tcPr>
+          <w:p>
+            <w:r>
+              <w:t>vuota di default; DBG=-g genera il file .dbg per il debugger e disattiva l'ottimizzazione (xlc forza NOOPTIMIZE con -g, indipendentemente dall'ordine delle opzioni).</w:t>
+            </w:r>
+          </w:p>
+        </w:tc>
+      </w:tr>
+      <w:tr>
+        <w:tc>
+          <w:tcPr>
+            <w:tcW w:type="dxa" w:w="1984"/>
+          </w:tcPr>
+          <w:p>
+            <w:r>
+              <w:t>AGGR</w:t>
+            </w:r>
+          </w:p>
+        </w:tc>
+        <w:tc>
+          <w:tcPr>
+            <w:tcW w:type="dxa" w:w="7087"/>
+          </w:tcPr>
+          <w:p>
+            <w:r>
+              <w:t>vuota di default; AGGR=-Wc,AGGREGATE aggiunge ai listati la mappa di struct e union con gli offset dei campi. Per un solo programma si può usare #pragma options(aggregate).</w:t>
+            </w:r>
+          </w:p>
+        </w:tc>
+      </w:tr>
+    </w:tbl>
+    <w:p>
+      <w:r>
+        <w:t>make non rileva il cambio di opzioni: quando si attiva o disattiva DBG o AGGR occorre usare -u, ad esempio make -u -f smf80ext.mk DBG=-g. Le routine Metal C sono volutamente compilate senza ottimizzazione: sono piccole, contengono HLASM inline e sono richiamate poche volte.</w:t>
+      </w:r>
+    </w:p>
+    <w:p>
+      <w:r>
+        <w:t>Effetto dell'ottimizzazione, misurato su un'elaborazione massiva di 1.374.748.727 record SMF (570.536 estratti, stesso output nei due casi):</w:t>
+      </w:r>
+    </w:p>
+    <w:tbl>
+      <w:tblPr>
+        <w:tblStyle w:val="LightGrid-Accent1"/>
+        <w:tblW w:type="auto" w:w="0"/>
+        <w:jc w:val="center"/>
+        <w:tblLook w:firstColumn="1" w:firstRow="1" w:lastColumn="0" w:lastRow="0" w:noHBand="0" w:noVBand="1" w:val="04A0"/>
+      </w:tblPr>
+      <w:tblGrid>
+        <w:gridCol w:w="4873"/>
+        <w:gridCol w:w="4873"/>
+      </w:tblGrid>
+      <w:tr>
+        <w:tc>
+          <w:tcPr>
+            <w:tcW w:type="dxa" w:w="1984"/>
+            <w:shd w:val="clear" w:color="auto" w:fill="1F3A5F"/>
+          </w:tcPr>
+          <w:p>
+            <w:r>
+              <w:rPr>
+                <w:b/>
+                <w:color w:val="FFFFFF"/>
+              </w:rPr>
               <w:t>Misura</w:t>
             </w:r>
           </w:p>
@@ -13641,7 +13822,7 @@
     </w:p>
     <w:p>
       <w:r>
-        <w:t>Compila le funzioni di supporto nella libreria statica myext.a e poi il programma principale. Il makefile non è ancora allineato alla nuova gestione delle classi: l'elenco MYMEMB contiene ancora getCls e non comprende get_CDT, irrcdt, irrauth e gli oggetti Metal C, mentre getParm richiama get_CDT. Va aggiornato prima di ricompilare smf80dmp.</w:t>
+        <w:t>Ha la stessa struttura di smf80ext.mk (stesse variabili, stessi listati in ./lst, messaggi del binder in ./lst/smf80dmp.lnk) e condivide con esso gli oggetti. Non compila smf81dec.c, irrauth.c e le routine Metal C non necessarie: linka solo racfree_metal (FREEMAIN) e racstat_metal (RACROUTE STAT), richiesti da get_CDT.c e irrcdt.c.</w:t>
       </w:r>
     </w:p>
     <w:p>

</xml_diff>